<commit_message>
progres fatima 23 july 2026
</commit_message>
<xml_diff>
--- a/Progres-Fatimah/Jurnal Submit/submit/TJPH/Narmawan/revision/TJPH_Main_Manuscript+Revision+Admin (1).docx
+++ b/Progres-Fatimah/Jurnal Submit/submit/TJPH/Narmawan/revision/TJPH_Main_Manuscript+Revision+Admin (1).docx
@@ -1,6 +1,6 @@
 
 <file path=word/document.xml><?xml version="1.0" encoding="utf-8"?>
-<w:document xmlns:wpc="http://schemas.microsoft.com/office/word/2010/wordprocessingCanvas" xmlns:cx="http://schemas.microsoft.com/office/drawing/2014/chartex" xmlns:cx1="http://schemas.microsoft.com/office/drawing/2015/9/8/chartex" xmlns:cx2="http://schemas.microsoft.com/office/drawing/2015/10/21/chartex" xmlns:cx3="http://schemas.microsoft.com/office/drawing/2016/5/9/chartex" xmlns:cx4="http://schemas.microsoft.com/office/drawing/2016/5/10/chartex" xmlns:cx5="http://schemas.microsoft.com/office/drawing/2016/5/11/chartex" xmlns:cx6="http://schemas.microsoft.com/office/drawing/2016/5/12/chartex" xmlns:cx7="http://schemas.microsoft.com/office/drawing/2016/5/13/chartex" xmlns:cx8="http://schemas.microsoft.com/office/drawing/2016/5/14/chartex" xmlns:mc="http://schemas.openxmlformats.org/markup-compatibility/2006" xmlns:aink="http://schemas.microsoft.com/office/drawing/2016/ink" xmlns:am3d="http://schemas.microsoft.com/office/drawing/2017/model3d" xmlns:o="urn:schemas-microsoft-com:office:office" xmlns:r="http://schemas.openxmlformats.org/officeDocument/2006/relationships" xmlns:m="http://schemas.openxmlformats.org/officeDocument/2006/math" xmlns:v="urn:schemas-microsoft-com:vml" xmlns:wp14="http://schemas.microsoft.com/office/word/2010/wordprocessingDrawing" xmlns:wp="http://schemas.openxmlformats.org/drawingml/2006/wordprocessingDrawing" xmlns:w10="urn:schemas-microsoft-com:office:word" xmlns:w="http://schemas.openxmlformats.org/wordprocessingml/2006/main" xmlns:w14="http://schemas.microsoft.com/office/word/2010/wordml" xmlns:w15="http://schemas.microsoft.com/office/word/2012/wordml" xmlns:w16cex="http://schemas.microsoft.com/office/word/2018/wordml/cex" xmlns:w16cid="http://schemas.microsoft.com/office/word/2016/wordml/cid" xmlns:w16="http://schemas.microsoft.com/office/word/2018/wordml" xmlns:w16sdtdh="http://schemas.microsoft.com/office/word/2020/wordml/sdtdatahash" xmlns:w16se="http://schemas.microsoft.com/office/word/2015/wordml/symex" xmlns:wpg="http://schemas.microsoft.com/office/word/2010/wordprocessingGroup" xmlns:wpi="http://schemas.microsoft.com/office/word/2010/wordprocessingInk" xmlns:wne="http://schemas.microsoft.com/office/word/2006/wordml" xmlns:wps="http://schemas.microsoft.com/office/word/2010/wordprocessingShape" mc:Ignorable="w14 w15 w16se w16cid w16 w16cex w16sdtdh wp14">
+<w:document xmlns:wpc="http://schemas.microsoft.com/office/word/2010/wordprocessingCanvas" xmlns:cx="http://schemas.microsoft.com/office/drawing/2014/chartex" xmlns:cx1="http://schemas.microsoft.com/office/drawing/2015/9/8/chartex" xmlns:cx2="http://schemas.microsoft.com/office/drawing/2015/10/21/chartex" xmlns:cx3="http://schemas.microsoft.com/office/drawing/2016/5/9/chartex" xmlns:cx4="http://schemas.microsoft.com/office/drawing/2016/5/10/chartex" xmlns:cx5="http://schemas.microsoft.com/office/drawing/2016/5/11/chartex" xmlns:cx6="http://schemas.microsoft.com/office/drawing/2016/5/12/chartex" xmlns:cx7="http://schemas.microsoft.com/office/drawing/2016/5/13/chartex" xmlns:cx8="http://schemas.microsoft.com/office/drawing/2016/5/14/chartex" xmlns:mc="http://schemas.openxmlformats.org/markup-compatibility/2006" xmlns:aink="http://schemas.microsoft.com/office/drawing/2016/ink" xmlns:am3d="http://schemas.microsoft.com/office/drawing/2017/model3d" xmlns:o="urn:schemas-microsoft-com:office:office" xmlns:oel="http://schemas.microsoft.com/office/2019/extlst" xmlns:r="http://schemas.openxmlformats.org/officeDocument/2006/relationships" xmlns:m="http://schemas.openxmlformats.org/officeDocument/2006/math" xmlns:v="urn:schemas-microsoft-com:vml" xmlns:wp14="http://schemas.microsoft.com/office/word/2010/wordprocessingDrawing" xmlns:wp="http://schemas.openxmlformats.org/drawingml/2006/wordprocessingDrawing" xmlns:w10="urn:schemas-microsoft-com:office:word" xmlns:w="http://schemas.openxmlformats.org/wordprocessingml/2006/main" xmlns:w14="http://schemas.microsoft.com/office/word/2010/wordml" xmlns:w15="http://schemas.microsoft.com/office/word/2012/wordml" xmlns:w16cex="http://schemas.microsoft.com/office/word/2018/wordml/cex" xmlns:w16cid="http://schemas.microsoft.com/office/word/2016/wordml/cid" xmlns:w16="http://schemas.microsoft.com/office/word/2018/wordml" xmlns:w16du="http://schemas.microsoft.com/office/word/2023/wordml/word16du" xmlns:w16sdtdh="http://schemas.microsoft.com/office/word/2020/wordml/sdtdatahash" xmlns:w16sdtfl="http://schemas.microsoft.com/office/word/2024/wordml/sdtformatlock" xmlns:w16se="http://schemas.microsoft.com/office/word/2015/wordml/symex" xmlns:wpg="http://schemas.microsoft.com/office/word/2010/wordprocessingGroup" xmlns:wpi="http://schemas.microsoft.com/office/word/2010/wordprocessingInk" xmlns:wne="http://schemas.microsoft.com/office/word/2006/wordml" xmlns:wps="http://schemas.microsoft.com/office/word/2010/wordprocessingShape" mc:Ignorable="w14 w15 w16se w16cid w16 w16cex w16sdtdh w16sdtfl w16du wp14">
   <w:body>
     <w:p>
       <w:pPr>
@@ -60,23 +60,21 @@
           <w:color w:val="0035AD"/>
           <w:sz w:val="36"/>
         </w:rPr>
-        <w:t xml:space="preserve">, </w:t>
-      </w:r>
-      <w:proofErr w:type="spellStart"/>
+        <w:t>, K</w:t>
+      </w:r>
       <w:r>
         <w:rPr>
           <w:color w:val="0035AD"/>
           <w:sz w:val="36"/>
         </w:rPr>
-        <w:t>Kdek</w:t>
-      </w:r>
-      <w:proofErr w:type="spellEnd"/>
+        <w:t>a</w:t>
+      </w:r>
       <w:r>
         <w:rPr>
           <w:color w:val="0035AD"/>
           <w:sz w:val="36"/>
         </w:rPr>
-        <w:t xml:space="preserve"> Ayu Erika</w:t>
+        <w:t>dek Ayu Erika</w:t>
       </w:r>
       <w:r>
         <w:rPr>
@@ -122,13 +120,15 @@
         <w:rPr>
           <w:sz w:val="28"/>
         </w:rPr>
-        <w:t xml:space="preserve">1 Nursing Science Study Program, Karya Kesehatan Health College of </w:t>
-      </w:r>
+        <w:t>1 Nursing Science Study Program, Karya Kesehatan Health College of Kendari, Kendari, Indonesia</w:t>
+      </w:r>
+    </w:p>
+    <w:p>
       <w:r>
         <w:rPr>
           <w:sz w:val="28"/>
         </w:rPr>
-        <w:t>Kendari, Kendari, Indonesia</w:t>
+        <w:t>2 Department of Community Nursing, Faculty of Nursing, Hasanuddin University, Makassar, Indonesia</w:t>
       </w:r>
     </w:p>
     <w:p>
@@ -136,7 +136,7 @@
         <w:rPr>
           <w:sz w:val="28"/>
         </w:rPr>
-        <w:t>2 Department of Community Nursing, Faculty of Nursing, Hasanuddin University, Makassar, Indonesia</w:t>
+        <w:t>3 Nursing Science Study Program, Faculty of Nursing, Hasanuddin University, Makassar, Indonesia</w:t>
       </w:r>
     </w:p>
     <w:p>
@@ -144,7 +144,7 @@
         <w:rPr>
           <w:sz w:val="28"/>
         </w:rPr>
-        <w:t>3 Nursing Science Study Program, Faculty of Nursing, Hasanuddin University, Makassar, Indonesia</w:t>
+        <w:t>4 Ners Professional Study Program, Karya Kesehatan Health College of Kendari, Kendari, Indonesia</w:t>
       </w:r>
     </w:p>
     <w:p>
@@ -152,35 +152,15 @@
         <w:rPr>
           <w:sz w:val="28"/>
         </w:rPr>
-        <w:t>4 Ners Professional Study Program,</w:t>
-      </w:r>
+        <w:t>Correspondence: Narmawan, Stikes Karya Kesehatan, Jl. A.H. Nasution No.89, Kendari 93232, Indonesia, E-mail: narmawanfebson@gmail.com</w:t>
+      </w:r>
+    </w:p>
+    <w:p>
       <w:r>
         <w:rPr>
           <w:sz w:val="28"/>
         </w:rPr>
-        <w:t xml:space="preserve"> Karya Kesehatan Health College of Kendari, Kendari, Indonesia</w:t>
-      </w:r>
-    </w:p>
-    <w:p>
-      <w:r>
-        <w:rPr>
-          <w:sz w:val="28"/>
-        </w:rPr>
-        <w:t>Correspondence: Narmawan, Stikes Karya Kesehatan, Jl. A.H. Nasution No.89, Kendari 93232, Indonesia, E-mail: narmawanfebson@gmail.com</w:t>
-      </w:r>
-    </w:p>
-    <w:p>
-      <w:r>
-        <w:rPr>
-          <w:sz w:val="28"/>
-        </w:rPr>
-        <w:t>Received: Month Day Year; Revised: Month Day Year; Accepted</w:t>
-      </w:r>
-      <w:r>
-        <w:rPr>
-          <w:sz w:val="28"/>
-        </w:rPr>
-        <w:t>: Month Day Year</w:t>
+        <w:t>Received: Month Day Year; Revised: Month Day Year; Accepted: Month Day Year</w:t>
       </w:r>
     </w:p>
     <w:p>
@@ -272,7 +252,7 @@
           </mc:Choice>
           <mc:Fallback>
             <w:pict>
-              <v:line w14:anchorId="23743D7A" id="Straight Connector 26" o:spid="_x0000_s1026" style="position:absolute;z-index:251659264;visibility:visible;mso-wrap-style:square;mso-wrap-distance-left:9pt;mso-wrap-distance-top:0;mso-wrap-distance-right:9pt;mso-wrap-distance-bottom:0;mso-position-horizontal:absolute;mso-position-horizontal-relative:text;mso-position-vertical:absolute;mso-position-vertical-relative:text" from="0,19.65pt" to="466.5pt,19.65pt" o:gfxdata="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" strokecolor="#0035ad" strokeweight="1.5pt">
+              <v:line w14:anchorId="2FAE7174" id="Straight Connector 26" o:spid="_x0000_s1026" style="position:absolute;z-index:251659264;visibility:visible;mso-wrap-style:square;mso-wrap-distance-left:9pt;mso-wrap-distance-top:0;mso-wrap-distance-right:9pt;mso-wrap-distance-bottom:0;mso-position-horizontal:absolute;mso-position-horizontal-relative:text;mso-position-vertical:absolute;mso-position-vertical-relative:text" from="0,19.65pt" to="466.5pt,19.65pt" o:gfxdata="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" strokecolor="#0035ad" strokeweight="1.5pt">
                 <v:stroke joinstyle="miter"/>
               </v:line>
             </w:pict>
@@ -296,22 +276,7 @@
         <w:jc w:val="both"/>
       </w:pPr>
       <w:r>
-        <w:t>Diabetic foot complications increase disability, hospitalization, amputation risk, and health care burden among people with type 2 diabetes. This study developed and evaluated a Theory of Planned Behavior-based diabetic foot car</w:t>
-      </w:r>
-      <w:r>
-        <w:t>e instrument for community-based primary care. A quantitative non-experimental study was conducted through instrument development, content validity assessment, and reliability testing. Ninety-three patients with type 2 diabetes from nine community health c</w:t>
-      </w:r>
-      <w:r>
-        <w:t>enters in Kendari, Indonesia, were recruited using proportional stratified random sampling. Four experts assessed content validity using the Content Validity Index. Internal consistency was examined using Cronbach's alpha, and test-retest reliability was a</w:t>
-      </w:r>
-      <w:r>
-        <w:t>nalyzed using Spearman correlation. The final instrument contained 40 items across intention, attitudes, subjective norms, and perceived behavioral control. Item-level validity scores ranged from 0.75 to 1.00, with an average Content Validity Index of 0.90</w:t>
-      </w:r>
-      <w:r>
-        <w:t>. Cronbach's alpha ranged from 0.70 to 0.82 across domains, and the overall alpha was 0.88. Ethical approval was granted by Hasanuddin University Ethics Committee, approval number 184/H4.8.4.5.31/PP36-KOMETIK/2025, on March 5, 2025. The instrument may supp</w:t>
-      </w:r>
-      <w:r>
-        <w:t>ort behavioral assessment and targeted foot care education in primary care.</w:t>
+        <w:t>Diabetic foot complications increase disability, hospitalization, amputation risk, and health care burden among people with type 2 diabetes. This study developed and evaluated a Theory of Planned Behavior-based diabetic foot care instrument for community-based primary care. A quantitative non-experimental study was conducted through instrument development, content validity assessment, and reliability testing. Ninety-three patients with type 2 diabetes from nine community health centers in Kendari, Indonesia, were recruited using proportional stratified random sampling. Four experts assessed content validity using the Content Validity Index. Internal consistency was examined using Cronbach's alpha, and test-retest reliability was analyzed using Spearman correlation. The final instrument contained 40 items across intention, attitudes, subjective norms, and perceived behavioral control. Item-level validity scores ranged from 0.75 to 1.00, with an average Content Validity Index of 0.90. Cronbach's alpha ranged from 0.70 to 0.82 across domains, and the overall alpha was 0.88. Ethical approval was granted by Hasanuddin University Ethics Committee, approval number 184/H4.8.4.5.31/PP36-KOMETIK/2025, on March 5, 2025. The instrument may support behavioral assessment and targeted foot care education in primary care.</w:t>
       </w:r>
     </w:p>
     <w:p>
@@ -344,10 +309,7 @@
       </w:r>
       <w:r>
         <w:tab/>
-        <w:t xml:space="preserve">Diabetic foot prevention depends on daily </w:t>
-      </w:r>
-      <w:r>
-        <w:t>patient foot care behavior.</w:t>
+        <w:t>Diabetic foot prevention depends on daily patient foot care behavior.</w:t>
       </w:r>
     </w:p>
     <w:p>
@@ -384,10 +346,7 @@
       </w:r>
       <w:r>
         <w:tab/>
-        <w:t xml:space="preserve">Larger studies should test its structure in diverse </w:t>
-      </w:r>
-      <w:r>
-        <w:t>communities.</w:t>
+        <w:t>Larger studies should test its structure in diverse communities.</w:t>
       </w:r>
     </w:p>
     <w:p>
@@ -412,10 +371,7 @@
         <w:jc w:val="both"/>
       </w:pPr>
       <w:r>
-        <w:t>Diabetes mellitus is one of the most common chronic diseases worldwide and remains a major public health challenge. Its increasing prevalence contributes to long-term morbidity, disability, premature mortality, and rising health c</w:t>
-      </w:r>
-      <w:r>
-        <w:t>are costs.</w:t>
+        <w:t>Diabetes mellitus is one of the most common chronic diseases worldwide and remains a major public health challenge. Its increasing prevalence contributes to long-term morbidity, disability, premature mortality, and rising health care costs.</w:t>
       </w:r>
       <w:r>
         <w:rPr>
@@ -441,10 +397,7 @@
         <w:jc w:val="both"/>
       </w:pPr>
       <w:r>
-        <w:t>Diabetic foot disease is among the most serious diabetes-</w:t>
-      </w:r>
-      <w:r>
-        <w:t>related complications. It is commonly associated with peripheral neuropathy, peripheral vascular impairment, infection, ulceration, and lower-extremity amputation if preventive care is not maintained.</w:t>
+        <w:t>Diabetic foot disease is among the most serious diabetes-related complications. It is commonly associated with peripheral neuropathy, peripheral vascular impairment, infection, ulceration, and lower-extremity amputation if preventive care is not maintained.</w:t>
       </w:r>
       <w:r>
         <w:rPr>
@@ -454,10 +407,7 @@
         <w:t>3,4</w:t>
       </w:r>
       <w:r>
-        <w:t xml:space="preserve"> The global burden of diabetes-related lower-extremit</w:t>
-      </w:r>
-      <w:r>
-        <w:t>y complications remains substantial, particularly because these complications increase disability and long-term health service use.</w:t>
+        <w:t xml:space="preserve"> The global burden of diabetes-related lower-extremity complications remains substantial, particularly because these complications increase disability and long-term health service use.</w:t>
       </w:r>
       <w:r>
         <w:rPr>
@@ -473,10 +423,7 @@
         <w:jc w:val="both"/>
       </w:pPr>
       <w:r>
-        <w:t>Preventive foot care is a key component of diabetes self-management. Daily foot inspection, proper hygiene, appropriate f</w:t>
-      </w:r>
-      <w:r>
-        <w:t>ootwear use, early identification of abnormalities, and timely contact with health care professionals can reduce the risk of ulceration and amputation.</w:t>
+        <w:t>Preventive foot care is a key component of diabetes self-management. Daily foot inspection, proper hygiene, appropriate footwear use, early identification of abnormalities, and timely contact with health care professionals can reduce the risk of ulceration and amputation.</w:t>
       </w:r>
       <w:r>
         <w:rPr>
@@ -486,10 +433,7 @@
         <w:t>3,6,7</w:t>
       </w:r>
       <w:r>
-        <w:t xml:space="preserve"> These behaviors are especially important in primary care settings, where patients with diabetes oft</w:t>
-      </w:r>
-      <w:r>
-        <w:t>en receive routine education and follow-up.</w:t>
+        <w:t xml:space="preserve"> These behaviors are especially important in primary care settings, where patients with diabetes often receive routine education and follow-up.</w:t>
       </w:r>
     </w:p>
     <w:p>
@@ -498,24 +442,43 @@
         <w:jc w:val="both"/>
       </w:pPr>
       <w:r>
-        <w:t>Patient behavior is central to diabetic foot prevention. Nurses and community health providers need practical instruments to assess whether patients intend to perform foot care, hold favorable attitudes toward pr</w:t>
-      </w:r>
-      <w:r>
-        <w:t>evention, receive social support, and feel able to practice foot care consistently. However, standardized theory-based instruments designed specifically for diabetic foot care behavior remain limited, particularly for community-based prevention programs.</w:t>
+        <w:t>Patient behavior is central to diabetic foot prevention. Nurses and community health providers need practical instruments to assess whether patients intend to perform foot care, hold favorable attitudes toward prevention, receive social support, and feel able to practice foot care consistently. However, standardized theory-based instruments designed specifically for diabetic foot care behavior remain limited, particularly for community-based prevention programs.</w:t>
       </w:r>
       <w:r>
         <w:rPr>
           <w:sz w:val="28"/>
           <w:vertAlign w:val="superscript"/>
         </w:rPr>
-        <w:t>8,</w:t>
+        <w:t>8,9</w:t>
+      </w:r>
+    </w:p>
+    <w:p>
+      <w:pPr>
+        <w:ind w:firstLine="709"/>
+        <w:jc w:val="both"/>
+      </w:pPr>
+      <w:r>
+        <w:t>The Theory of Planned Behavior is a widely used framework for explaining health behavior. The theory proposes that attitudes, subjective norms, and perceived behavioral control influence behavioral intention and subsequent behavior.</w:t>
       </w:r>
       <w:r>
         <w:rPr>
           <w:sz w:val="28"/>
           <w:vertAlign w:val="superscript"/>
         </w:rPr>
-        <w:t>9</w:t>
+        <w:t>10,11</w:t>
+      </w:r>
+      <w:r>
+        <w:t xml:space="preserve"> It has been applied to diabetes-related self-care behaviors, including education programs and preventive practices.</w:t>
+      </w:r>
+      <w:r>
+        <w:rPr>
+          <w:sz w:val="28"/>
+          <w:vertAlign w:val="superscript"/>
+        </w:rPr>
+        <w:t>12,13</w:t>
+      </w:r>
+      <w:r>
+        <w:t xml:space="preserve"> A diabetic foot care instrument grounded in this theory may help health workers identify behavioral barriers and design more targeted health promotion strategies.</w:t>
       </w:r>
     </w:p>
     <w:p>
@@ -524,49 +487,8 @@
         <w:jc w:val="both"/>
       </w:pPr>
       <w:r>
-        <w:t>The Theory of Planned Behavior is a widely used framework for explaining health behavior. The theory proposes that attitudes, subjective norms, and perceived behavioral control influence behavioral intention and subsequent behavior.</w:t>
-      </w:r>
-      <w:r>
-        <w:rPr>
-          <w:sz w:val="28"/>
-          <w:vertAlign w:val="superscript"/>
-        </w:rPr>
-        <w:t>10,11</w:t>
-      </w:r>
-      <w:r>
-        <w:t xml:space="preserve"> It has been appl</w:t>
-      </w:r>
-      <w:r>
-        <w:t>ied to diabetes-related self-care behaviors, including education programs and preventive practices.</w:t>
-      </w:r>
-      <w:r>
-        <w:rPr>
-          <w:sz w:val="28"/>
-          <w:vertAlign w:val="superscript"/>
-        </w:rPr>
-        <w:t>12,13</w:t>
-      </w:r>
-      <w:r>
-        <w:t xml:space="preserve"> A diabetic foot care instrument grounded in this theory may help health workers identify behavioral barriers and design more targeted health promotion </w:t>
-      </w:r>
-      <w:r>
-        <w:t>strategies.</w:t>
-      </w:r>
-    </w:p>
-    <w:p>
-      <w:pPr>
-        <w:ind w:firstLine="709"/>
-        <w:jc w:val="both"/>
-      </w:pPr>
-      <w:r>
         <w:lastRenderedPageBreak/>
-        <w:t>From a public health perspective, a valid and reliable behavioral assessment tool is needed to support community-based diabetic foot prevention. Such an instrument can help identify patients at risk of poor preventive behavior, guide nursing ed</w:t>
-      </w:r>
-      <w:r>
-        <w:t>ucation, and support primary care programs aimed at reducing avoidable diabetic foot complications. Therefore, this study aimed to develop and evaluate the validity and reliability of a Theory of Planned Behavior-based diabetic foot care instrument among p</w:t>
-      </w:r>
-      <w:r>
-        <w:t>atients with type 2 diabetes in primary care settings.</w:t>
+        <w:t>From a public health perspective, a valid and reliable behavioral assessment tool is needed to support community-based diabetic foot prevention. Such an instrument can help identify patients at risk of poor preventive behavior, guide nursing education, and support primary care programs aimed at reducing avoidable diabetic foot complications. Therefore, this study aimed to develop and evaluate the validity and reliability of a Theory of Planned Behavior-based diabetic foot care instrument among patients with type 2 diabetes in primary care settings.</w:t>
       </w:r>
     </w:p>
     <w:p>
@@ -603,13 +525,7 @@
         <w:jc w:val="both"/>
       </w:pPr>
       <w:r>
-        <w:t>This quantitative non-experimental study was designed to develop and evaluate the psychometric properties of a Theory of Planned Behavior-based diabeti</w:t>
-      </w:r>
-      <w:r>
-        <w:t>c foot care instrument. The study was conducted in community-based primary care settings to ensure that the instrument was relevant for public health and preventive nursing programs. The study was implemented in three sequential phases: instrument developm</w:t>
-      </w:r>
-      <w:r>
-        <w:t>ent, content validity assessment, and reliability testing.</w:t>
+        <w:t>This quantitative non-experimental study was designed to develop and evaluate the psychometric properties of a Theory of Planned Behavior-based diabetic foot care instrument. The study was conducted in community-based primary care settings to ensure that the instrument was relevant for public health and preventive nursing programs. The study was implemented in three sequential phases: instrument development, content validity assessment, and reliability testing.</w:t>
       </w:r>
     </w:p>
     <w:p>
@@ -630,10 +546,7 @@
         <w:jc w:val="both"/>
       </w:pPr>
       <w:r>
-        <w:t>The initial phase involved a literature review on diabetic foot prevention, self-care behavior, and the Theory of Planned Behavior. The content of the instrument was devel</w:t>
-      </w:r>
-      <w:r>
-        <w:t>oped by integrating the theoretical constructs of intention, attitudes, subjective norms, and perceived behavioral control with established diabetic foot prevention recommendations.</w:t>
+        <w:t>The initial phase involved a literature review on diabetic foot prevention, self-care behavior, and the Theory of Planned Behavior. The content of the instrument was developed by integrating the theoretical constructs of intention, attitudes, subjective norms, and perceived behavioral control with established diabetic foot prevention recommendations.</w:t>
       </w:r>
       <w:r>
         <w:rPr>
@@ -643,10 +556,7 @@
         <w:t>3,10,11</w:t>
       </w:r>
       <w:r>
-        <w:t xml:space="preserve"> The prevention recommendations included routine monitoring of neuro</w:t>
-      </w:r>
-      <w:r>
-        <w:t>pathy symptoms, regular foot examination, daily hygiene, nail care, avoidance of barefoot walking, appropriate footwear use, and early management of foot abnormalities by trained health care professionals.</w:t>
+        <w:t xml:space="preserve"> The prevention recommendations included routine monitoring of neuropathy symptoms, regular foot examination, daily hygiene, nail care, avoidance of barefoot walking, appropriate footwear use, and early management of foot abnormalities by trained health care professionals.</w:t>
       </w:r>
       <w:r>
         <w:rPr>
@@ -661,13 +571,7 @@
         <w:jc w:val="both"/>
       </w:pPr>
       <w:r>
-        <w:t>A preliminary 40-item instrument was developed to</w:t>
-      </w:r>
-      <w:r>
-        <w:t xml:space="preserve"> assess four behavioral domains: intention, attitudes, subjective norms, and perceived behavioral control. The intention domain contained 6 items, the attitudes domain contained 12 items, the subjective norms domain contained 11 items, and the perceived be</w:t>
-      </w:r>
-      <w:r>
-        <w:t>havioral control domain contained 11 items. Each item was designed to capture behavioral determinants related to preventive diabetic foot care among patients with type 2 diabetes.</w:t>
+        <w:t>A preliminary 40-item instrument was developed to assess four behavioral domains: intention, attitudes, subjective norms, and perceived behavioral control. The intention domain contained 6 items, the attitudes domain contained 12 items, the subjective norms domain contained 11 items, and the perceived behavioral control domain contained 11 items. Each item was designed to capture behavioral determinants related to preventive diabetic foot care among patients with type 2 diabetes.</w:t>
       </w:r>
     </w:p>
     <w:p>
@@ -688,17 +592,11 @@
         <w:jc w:val="both"/>
       </w:pPr>
       <w:r>
-        <w:t>Content validity was evaluated using the Cont</w:t>
-      </w:r>
-      <w:r>
-        <w:t xml:space="preserve">ent Validity Index to determine the relevance, clarity, conceptual appropriateness, and representativeness of each item. Four health care professionals with expertise in diabetic wound care and diabetic foot management served as the expert panel. All </w:t>
+        <w:t xml:space="preserve">Content validity was evaluated using the Content Validity Index to determine the relevance, clarity, conceptual appropriateness, and representativeness of each item. Four health care professionals with expertise in diabetic wound care and diabetic foot management served as the expert panel. All </w:t>
       </w:r>
       <w:r>
         <w:lastRenderedPageBreak/>
-        <w:t>exper</w:t>
-      </w:r>
-      <w:r>
-        <w:t>ts had more than five years of clinical experience and were actively involved in diabetic foot management programs.</w:t>
+        <w:t>experts had more than five years of clinical experience and were actively involved in diabetic foot management programs.</w:t>
       </w:r>
     </w:p>
     <w:p>
@@ -706,10 +604,7 @@
         <w:jc w:val="both"/>
       </w:pPr>
       <w:r>
-        <w:t>Each item was assessed using a four-point relevance scale, ranging from 1, not relevant, to 4, highly relevant. The item-level Content Valid</w:t>
-      </w:r>
-      <w:r>
-        <w:t>ity Index was calculated from the proportion of experts rating an item as 3 or 4. An average Content Validity Index of at least 0.80 was considered excellent, whereas a value of at least 0.70 was considered acceptable for instrument development.</w:t>
+        <w:t>Each item was assessed using a four-point relevance scale, ranging from 1, not relevant, to 4, highly relevant. The item-level Content Validity Index was calculated from the proportion of experts rating an item as 3 or 4. An average Content Validity Index of at least 0.80 was considered excellent, whereas a value of at least 0.70 was considered acceptable for instrument development.</w:t>
       </w:r>
       <w:r>
         <w:rPr>
@@ -728,13 +623,7 @@
         <w:rPr>
           <w:i/>
         </w:rPr>
-        <w:t>4. Pa</w:t>
-      </w:r>
-      <w:r>
-        <w:rPr>
-          <w:i/>
-        </w:rPr>
-        <w:t>rticipants and sampling</w:t>
+        <w:t>4. Participants and sampling</w:t>
       </w:r>
     </w:p>
     <w:p>
@@ -743,10 +632,7 @@
         <w:jc w:val="both"/>
       </w:pPr>
       <w:r>
-        <w:t>Participants were recruited using proportional stratified random sampling from nine community health centers in Kendari, Indonesia, namely Nambo, Abeli, Poasia, Mokoau, Jati Raya, Lepo-Lepo, Wua-Wua, Mekar, and Puuwatu. Data collect</w:t>
-      </w:r>
-      <w:r>
-        <w:t>ion was conducted from April to May 2025. Eligible participants were identified through medical records and diabetic foot risk assessment by trained health personnel.</w:t>
+        <w:t>Participants were recruited using proportional stratified random sampling from nine community health centers in Kendari, Indonesia, namely Nambo, Abeli, Poasia, Mokoau, Jati Raya, Lepo-Lepo, Wua-Wua, Mekar, and Puuwatu. Data collection was conducted from April to May 2025. Eligible participants were identified through medical records and diabetic foot risk assessment by trained health personnel.</w:t>
       </w:r>
     </w:p>
     <w:p>
@@ -754,16 +640,7 @@
         <w:jc w:val="both"/>
       </w:pPr>
       <w:r>
-        <w:t>The study included 93 patients diagnosed with type 2 diabetes mellitus based on physician</w:t>
-      </w:r>
-      <w:r>
-        <w:t xml:space="preserve"> diagnosis and medical records. Participants were eligible if they had fasting plasma glucose of at least 126 mg/dL or 2-hour plasma glucose of at least 200 mg/dL, were older than 20 years, and were classified as diabetic foot risk category 0, 1, or 2 acco</w:t>
-      </w:r>
-      <w:r>
-        <w:t>rding to the International Working Group on the Diabetic Foot classification system. All participants received an explanation of the study objectives and procedures before completing the questionnaire independently. Home visits were conducted when necessar</w:t>
-      </w:r>
-      <w:r>
-        <w:t>y to support recruitment and data completeness.</w:t>
+        <w:t>The study included 93 patients diagnosed with type 2 diabetes mellitus based on physician diagnosis and medical records. Participants were eligible if they had fasting plasma glucose of at least 126 mg/dL or 2-hour plasma glucose of at least 200 mg/dL, were older than 20 years, and were classified as diabetic foot risk category 0, 1, or 2 according to the International Working Group on the Diabetic Foot classification system. All participants received an explanation of the study objectives and procedures before completing the questionnaire independently. Home visits were conducted when necessary to support recruitment and data completeness.</w:t>
       </w:r>
     </w:p>
     <w:p>
@@ -784,10 +661,7 @@
         <w:jc w:val="both"/>
       </w:pPr>
       <w:r>
-        <w:t>Reliability testing was conducted to evaluate the internal consistency and temporal stability of the instrument. Internal consistency was assessed using Cronbach's alpha coefficient. Al</w:t>
-      </w:r>
-      <w:r>
-        <w:t>pha values of at least 0.70 were considered acceptable for a newly developed behavioral instrument.</w:t>
+        <w:t>Reliability testing was conducted to evaluate the internal consistency and temporal stability of the instrument. Internal consistency was assessed using Cronbach's alpha coefficient. Alpha values of at least 0.70 were considered acceptable for a newly developed behavioral instrument.</w:t>
       </w:r>
       <w:r>
         <w:rPr>
@@ -802,10 +676,7 @@
         <w:jc w:val="both"/>
       </w:pPr>
       <w:r>
-        <w:t>Test-retest reliability was assessed by administering the same instrument to the same participants on two occasions within an interval of three to seven days. Spearman correlation analysis was used to compare the first and second measurement scores. Correl</w:t>
-      </w:r>
-      <w:r>
-        <w:t xml:space="preserve">ation coefficients below 0.30 were interpreted as weak, 0.30 to 0.50 as moderate, and above 0.50 as strong. Statistical significance was set at </w:t>
+        <w:t xml:space="preserve">Test-retest reliability was assessed by administering the same instrument to the same participants on two occasions within an interval of three to seven days. Spearman correlation analysis was used to compare the first and second measurement scores. Correlation coefficients below 0.30 were interpreted as weak, 0.30 to 0.50 as moderate, and above 0.50 as strong. Statistical significance was set at </w:t>
       </w:r>
       <w:r>
         <w:rPr>
@@ -834,17 +705,11 @@
         <w:jc w:val="both"/>
       </w:pPr>
       <w:r>
-        <w:t>This study received ethical approval from the Health Research Ethics Committ</w:t>
-      </w:r>
-      <w:r>
-        <w:t xml:space="preserve">ee, Faculty of Medicine, Hasanuddin University, RSPTN Hasanuddin University, and Dr. Wahidin Sudirohusodo Hospital Makassar, Indonesia, with approval number 184/H4.8.4.5.31/PP36-KOMETIK/2025, dated March 5, 2025. </w:t>
+        <w:t xml:space="preserve">This study received ethical approval from the Health Research Ethics Committee, Faculty of Medicine, Hasanuddin University, RSPTN Hasanuddin University, and Dr. Wahidin Sudirohusodo Hospital Makassar, Indonesia, with approval number 184/H4.8.4.5.31/PP36-KOMETIK/2025, dated March 5, 2025. </w:t>
       </w:r>
       <w:r>
         <w:lastRenderedPageBreak/>
-        <w:t xml:space="preserve">The study protocol was reviewed through an </w:t>
-      </w:r>
-      <w:r>
-        <w:t>expedited review process. Written informed consent was obtained from all participants. Participant confidentiality, anonymity, and privacy were maintained throughout the study.</w:t>
+        <w:t>The study protocol was reviewed through an expedited review process. Written informed consent was obtained from all participants. Participant confidentiality, anonymity, and privacy were maintained throughout the study.</w:t>
       </w:r>
     </w:p>
     <w:p>
@@ -865,10 +730,7 @@
         <w:jc w:val="both"/>
       </w:pPr>
       <w:r>
-        <w:t>All statistical analyses were performed using SPSS version 23. Descriptive statistics were used to summarize participant characteristics. Content validity was evaluated using the Content Validity Index. Internal consistency was analyzed using Cronbach's al</w:t>
-      </w:r>
-      <w:r>
-        <w:t xml:space="preserve">pha coefficient, and test-retest reliability was assessed using Spearman correlation analysis. Probability values were reported using a lower-case italic </w:t>
+        <w:t xml:space="preserve">All statistical analyses were performed using SPSS version 23. Descriptive statistics were used to summarize participant characteristics. Content validity was evaluated using the Content Validity Index. Internal consistency was analyzed using Cronbach's alpha coefficient, and test-retest reliability was assessed using Spearman correlation analysis. Probability values were reported using a lower-case italic </w:t>
       </w:r>
       <w:r>
         <w:rPr>
@@ -923,13 +785,7 @@
         <w:jc w:val="both"/>
       </w:pPr>
       <w:r>
-        <w:t xml:space="preserve">This </w:t>
-      </w:r>
-      <w:r>
-        <w:t>study involved 93 patients with type 2 diabetes recruited from nine community health centers. The mean participant age was 53.05 years with a standard deviation of 8.05 years. Most participants were female, married, and had lived with diabetes for less tha</w:t>
-      </w:r>
-      <w:r>
-        <w:t>n five years. Higher education and senior high school were the most common educational backgrounds. Based on diabetic foot risk classification, most participants were in category 0, followed by category 1, category 2B, and category 2A (Table 1).</w:t>
+        <w:t>This study involved 93 patients with type 2 diabetes recruited from nine community health centers. The mean participant age was 53.05 years with a standard deviation of 8.05 years. Most participants were female, married, and had lived with diabetes for less than five years. Higher education and senior high school were the most common educational backgrounds. Based on diabetic foot risk classification, most participants were in category 0, followed by category 1, category 2B, and category 2A (Table 1).</w:t>
       </w:r>
     </w:p>
     <w:p>
@@ -941,10 +797,7 @@
         <w:t>Table 1</w:t>
       </w:r>
       <w:r>
-        <w:t xml:space="preserve"> Pa</w:t>
-      </w:r>
-      <w:r>
-        <w:t>rticipant characteristics</w:t>
+        <w:t xml:space="preserve"> Participant characteristics</w:t>
       </w:r>
     </w:p>
     <w:tbl>
@@ -1448,13 +1301,7 @@
               <w:rPr>
                 <w:sz w:val="28"/>
               </w:rPr>
-              <w:t xml:space="preserve">29 </w:t>
-            </w:r>
-            <w:r>
-              <w:rPr>
-                <w:sz w:val="28"/>
-              </w:rPr>
-              <w:t>(31.2)</w:t>
+              <w:t>29 (31.2)</w:t>
             </w:r>
           </w:p>
         </w:tc>
@@ -1990,13 +1837,7 @@
               <w:rPr>
                 <w:sz w:val="28"/>
               </w:rPr>
-              <w:t xml:space="preserve">13 </w:t>
-            </w:r>
-            <w:r>
-              <w:rPr>
-                <w:sz w:val="28"/>
-              </w:rPr>
-              <w:t>(14.0)</w:t>
+              <w:t>13 (14.0)</w:t>
             </w:r>
           </w:p>
         </w:tc>
@@ -2377,13 +2218,7 @@
         <w:rPr>
           <w:sz w:val="28"/>
         </w:rPr>
-        <w:t xml:space="preserve">a Based on the International Working Group on the </w:t>
-      </w:r>
-      <w:r>
-        <w:rPr>
-          <w:sz w:val="28"/>
-        </w:rPr>
-        <w:t>Diabetic Foot classification.</w:t>
+        <w:t>a Based on the International Working Group on the Diabetic Foot classification.</w:t>
       </w:r>
     </w:p>
     <w:p/>
@@ -2404,13 +2239,7 @@
         <w:jc w:val="both"/>
       </w:pPr>
       <w:r>
-        <w:t xml:space="preserve">The final instrument consisted of 40 items derived from the Theory of Planned Behavior and diabetic foot prevention recommendations. The instrument covered four </w:t>
-      </w:r>
-      <w:r>
-        <w:t>behavioral domains: intention, attitudes, subjective norms, and perceived behavioral control. The Content Validity Index for individual items ranged from 0.75 to 1.00, and the average Content Validity Index was 0.90. These results indicated acceptable to e</w:t>
-      </w:r>
-      <w:r>
-        <w:t>xcellent content validity and showed that the items adequately represented diabetic foot care behavior constructs.</w:t>
+        <w:t>The final instrument consisted of 40 items derived from the Theory of Planned Behavior and diabetic foot prevention recommendations. The instrument covered four behavioral domains: intention, attitudes, subjective norms, and perceived behavioral control. The Content Validity Index for individual items ranged from 0.75 to 1.00, and the average Content Validity Index was 0.90. These results indicated acceptable to excellent content validity and showed that the items adequately represented diabetic foot care behavior constructs.</w:t>
       </w:r>
     </w:p>
     <w:p>
@@ -2431,13 +2260,7 @@
         <w:jc w:val="both"/>
       </w:pPr>
       <w:r>
-        <w:t>Internal consistency analysis showed acceptable to good reliability across all domains. Cronbach's alpha coefficients</w:t>
-      </w:r>
-      <w:r>
-        <w:t xml:space="preserve"> ranged from 0.70 to 0.82 for the subscales, and the overall Cronbach's alpha coefficient was 0.88. Test-retest analysis showed moderate to strong correlations in most domains. However, the direct subjective norms and direct perceived behavioral control do</w:t>
-      </w:r>
-      <w:r>
-        <w:t>mains had weak and non-significant test-retest correlations. The reliability results are presented in Table 2.</w:t>
+        <w:t>Internal consistency analysis showed acceptable to good reliability across all domains. Cronbach's alpha coefficients ranged from 0.70 to 0.82 for the subscales, and the overall Cronbach's alpha coefficient was 0.88. Test-retest analysis showed moderate to strong correlations in most domains. However, the direct subjective norms and direct perceived behavioral control domains had weak and non-significant test-retest correlations. The reliability results are presented in Table 2.</w:t>
       </w:r>
     </w:p>
     <w:p>
@@ -3704,13 +3527,7 @@
         <w:jc w:val="both"/>
       </w:pPr>
       <w:r>
-        <w:t xml:space="preserve">This study developed and evaluated a </w:t>
-      </w:r>
-      <w:r>
-        <w:t>Theory of Planned Behavior-based instrument for assessing diabetic foot care behavior among patients with type 2 diabetes in primary care settings. The findings showed that the instrument had satisfactory content validity, internal consistency, and overall</w:t>
-      </w:r>
-      <w:r>
-        <w:t xml:space="preserve"> test-retest reliability. These results indicate that the instrument can be used to support behavioral assessment in community-based diabetic foot prevention programs.</w:t>
+        <w:t>This study developed and evaluated a Theory of Planned Behavior-based instrument for assessing diabetic foot care behavior among patients with type 2 diabetes in primary care settings. The findings showed that the instrument had satisfactory content validity, internal consistency, and overall test-retest reliability. These results indicate that the instrument can be used to support behavioral assessment in community-based diabetic foot prevention programs.</w:t>
       </w:r>
     </w:p>
     <w:p>
@@ -3719,10 +3536,7 @@
         <w:jc w:val="both"/>
       </w:pPr>
       <w:r>
-        <w:t>The average Content Validity Index of 0.90 suggests that the expert panel considered the</w:t>
-      </w:r>
-      <w:r>
-        <w:t xml:space="preserve"> items relevant and representative of the intended behavioral constructs. Strong content validity is important in instrument development because it helps ensure that the items adequately reflect the concept being measured.</w:t>
+        <w:t>The average Content Validity Index of 0.90 suggests that the expert panel considered the items relevant and representative of the intended behavioral constructs. Strong content validity is important in instrument development because it helps ensure that the items adequately reflect the concept being measured.</w:t>
       </w:r>
       <w:r>
         <w:rPr>
@@ -3732,10 +3546,7 @@
         <w:t>14,15</w:t>
       </w:r>
       <w:r>
-        <w:t xml:space="preserve"> In this study, combining dia</w:t>
-      </w:r>
-      <w:r>
-        <w:t>betic foot prevention recommendations with behavioral theory strengthened the relevance of the instrument for both clinical education and public health practice.</w:t>
+        <w:t xml:space="preserve"> In this study, combining diabetic foot prevention recommendations with behavioral theory strengthened the relevance of the instrument for both clinical education and public health practice.</w:t>
       </w:r>
     </w:p>
     <w:p>
@@ -3744,13 +3555,7 @@
         <w:jc w:val="both"/>
       </w:pPr>
       <w:r>
-        <w:t>Internal consistency reliability was also acceptable. Cronbach's alpha values for the instrume</w:t>
-      </w:r>
-      <w:r>
-        <w:t>nt domains ranged from 0.70 to 0.82, and the overall reliability coefficient was 0.88. These findings indicate that the instrument items consistently measured related aspects of diabetic foot care behavior. Previous psychometric studies of diabetic foot se</w:t>
-      </w:r>
-      <w:r>
-        <w:t>lf-care tools have also emphasized the importance of reliability testing before instruments are used in clinical or community populations.</w:t>
+        <w:t>Internal consistency reliability was also acceptable. Cronbach's alpha values for the instrument domains ranged from 0.70 to 0.82, and the overall reliability coefficient was 0.88. These findings indicate that the instrument items consistently measured related aspects of diabetic foot care behavior. Previous psychometric studies of diabetic foot self-care tools have also emphasized the importance of reliability testing before instruments are used in clinical or community populations.</w:t>
       </w:r>
       <w:r>
         <w:rPr>
@@ -3766,13 +3571,7 @@
         <w:jc w:val="both"/>
       </w:pPr>
       <w:r>
-        <w:t>Most test-retest correlations were moderate to strong, indicating that the instrument had satisfactory stabili</w:t>
-      </w:r>
-      <w:r>
-        <w:t>ty over time. The overall test-retest correlation was strong, although two direct domains showed weak and non-significant correlations. These weaker findings may reflect changes in participants' perceptions after completing the first questionnaire. Partici</w:t>
-      </w:r>
-      <w:r>
-        <w:t>pants may have become more aware of diabetic foot care after the first assessment, which could have influenced their responses during the second measurement.</w:t>
+        <w:t>Most test-retest correlations were moderate to strong, indicating that the instrument had satisfactory stability over time. The overall test-retest correlation was strong, although two direct domains showed weak and non-significant correlations. These weaker findings may reflect changes in participants' perceptions after completing the first questionnaire. Participants may have become more aware of diabetic foot care after the first assessment, which could have influenced their responses during the second measurement.</w:t>
       </w:r>
     </w:p>
     <w:p>
@@ -3781,17 +3580,11 @@
         <w:jc w:val="both"/>
       </w:pPr>
       <w:r>
-        <w:t>The use of the Theory of Planned Behavior provides a meaningful framework for understanding diabet</w:t>
-      </w:r>
-      <w:r>
-        <w:t xml:space="preserve">ic foot care behavior. Attitudes can indicate whether patients view foot care as beneficial, subjective norms can reflect perceived support from family or health workers, and perceived behavioral </w:t>
+        <w:t xml:space="preserve">The use of the Theory of Planned Behavior provides a meaningful framework for understanding diabetic foot care behavior. Attitudes can indicate whether patients view foot care as beneficial, subjective norms can reflect perceived support from family or health workers, and perceived behavioral </w:t>
       </w:r>
       <w:r>
         <w:lastRenderedPageBreak/>
-        <w:t>control can identify barriers that limit daily foot care. Th</w:t>
-      </w:r>
-      <w:r>
-        <w:t>ese constructs are relevant to diabetes self-management and health education programs.</w:t>
+        <w:t>control can identify barriers that limit daily foot care. These constructs are relevant to diabetes self-management and health education programs.</w:t>
       </w:r>
       <w:r>
         <w:rPr>
@@ -3807,13 +3600,7 @@
         <w:jc w:val="both"/>
       </w:pPr>
       <w:r>
-        <w:t xml:space="preserve">The instrument has practical implications for primary care and public health nursing. It may help nurses, diabetes educators, and community health workers identify </w:t>
-      </w:r>
-      <w:r>
-        <w:t>patients who need additional education or behavioral support. In routine care, this instrument could guide individualized counseling and help prioritize patients who are at risk of poor preventive behavior. At the program level, it may support community-ba</w:t>
-      </w:r>
-      <w:r>
-        <w:t>sed monitoring and evaluation of diabetic foot prevention activities.</w:t>
+        <w:t>The instrument has practical implications for primary care and public health nursing. It may help nurses, diabetes educators, and community health workers identify patients who need additional education or behavioral support. In routine care, this instrument could guide individualized counseling and help prioritize patients who are at risk of poor preventive behavior. At the program level, it may support community-based monitoring and evaluation of diabetic foot prevention activities.</w:t>
       </w:r>
     </w:p>
     <w:p>
@@ -3822,13 +3609,7 @@
         <w:jc w:val="both"/>
       </w:pPr>
       <w:r>
-        <w:t xml:space="preserve">Several limitations should be considered. First, the sample size was sufficient for content validity and reliability testing but limited for advanced psychometric analyses such as </w:t>
-      </w:r>
-      <w:r>
-        <w:t xml:space="preserve">exploratory and confirmatory factor analysis. Second, the test-retest interval ranged from three to seven days, and participant awareness or exposure to foot care information during this interval may have affected responses. Third, the study was conducted </w:t>
-      </w:r>
-      <w:r>
-        <w:t>in community health centers in one Indonesian city, which may limit generalizability to other populations and health systems.</w:t>
+        <w:t>Several limitations should be considered. First, the sample size was sufficient for content validity and reliability testing but limited for advanced psychometric analyses such as exploratory and confirmatory factor analysis. Second, the test-retest interval ranged from three to seven days, and participant awareness or exposure to foot care information during this interval may have affected responses. Third, the study was conducted in community health centers in one Indonesian city, which may limit generalizability to other populations and health systems.</w:t>
       </w:r>
     </w:p>
     <w:p>
@@ -3837,10 +3618,7 @@
         <w:jc w:val="both"/>
       </w:pPr>
       <w:r>
-        <w:t>Despite these limitations, the study contributes to the limited literature on theory-based diabetic foot care instruments. The fin</w:t>
-      </w:r>
-      <w:r>
-        <w:t>dings support the use of the instrument as a behavioral assessment tool in primary care and provide a foundation for future validation studies with larger and more diverse samples.</w:t>
+        <w:t>Despite these limitations, the study contributes to the limited literature on theory-based diabetic foot care instruments. The findings support the use of the instrument as a behavioral assessment tool in primary care and provide a foundation for future validation studies with larger and more diverse samples.</w:t>
       </w:r>
     </w:p>
     <w:p>
@@ -3865,16 +3643,7 @@
         <w:jc w:val="both"/>
       </w:pPr>
       <w:r>
-        <w:t xml:space="preserve">The Theory of Planned Behavior-based diabetic foot care </w:t>
-      </w:r>
-      <w:r>
-        <w:t>instrument demonstrated satisfactory validity and reliability for assessing preventive foot care behavior among patients with type 2 diabetes in primary care settings. The instrument showed strong content validity, acceptable internal consistency, and adeq</w:t>
-      </w:r>
-      <w:r>
-        <w:t>uate overall test-retest reliability. From a public health perspective, this instrument may support early identification of behavioral barriers, guide targeted health education, and strengthen community-based strategies to prevent diabetic foot complicatio</w:t>
-      </w:r>
-      <w:r>
-        <w:t>ns. Future studies should examine construct validity and test the instrument across larger and more diverse populations.</w:t>
+        <w:t>The Theory of Planned Behavior-based diabetic foot care instrument demonstrated satisfactory validity and reliability for assessing preventive foot care behavior among patients with type 2 diabetes in primary care settings. The instrument showed strong content validity, acceptable internal consistency, and adequate overall test-retest reliability. From a public health perspective, this instrument may support early identification of behavioral barriers, guide targeted health education, and strengthen community-based strategies to prevent diabetic foot complications. Future studies should examine construct validity and test the instrument across larger and more diverse populations.</w:t>
       </w:r>
     </w:p>
     <w:p>
@@ -3899,13 +3668,7 @@
         <w:jc w:val="both"/>
       </w:pPr>
       <w:r>
-        <w:t>This study received ethical approval from the Health Research Ethics Committee, Faculty of Medicine, Hasanud</w:t>
-      </w:r>
-      <w:r>
-        <w:t>din University, RSPTN Hasanuddin University, and Dr. Wahidin Sudirohusodo Hospital Makassar, Indonesia, with approval number 184/H4.8.4.5.31/PP36-KOMETIK/2025, dated March 5, 2025. Written informed consent was obtained from all participants before data col</w:t>
-      </w:r>
-      <w:r>
-        <w:t>lection.</w:t>
+        <w:t>This study received ethical approval from the Health Research Ethics Committee, Faculty of Medicine, Hasanuddin University, RSPTN Hasanuddin University, and Dr. Wahidin Sudirohusodo Hospital Makassar, Indonesia, with approval number 184/H4.8.4.5.31/PP36-KOMETIK/2025, dated March 5, 2025. Written informed consent was obtained from all participants before data collection.</w:t>
       </w:r>
     </w:p>
     <w:p>
@@ -3941,13 +3704,7 @@
         <w:jc w:val="both"/>
       </w:pPr>
       <w:r>
-        <w:t>N and S designed the study and developed the research concept. N, S, KAE, M, and ANM contributed to instrument development and content refinement. N and M coordinated data collection in community health centers. S and KAE sup</w:t>
-      </w:r>
-      <w:r>
-        <w:t>ervised the methodological process and interpretation of findings. N and ANM performed data checking and prepared the initial manuscript draft. All authors critically reviewed the manuscript, approved the final version for submission, and agreed to be acco</w:t>
-      </w:r>
-      <w:r>
-        <w:t>untable for the accuracy and integrity of the work.</w:t>
+        <w:t>N and S designed the study and developed the research concept. N, S, KAE, M, and ANM contributed to instrument development and content refinement. N and M coordinated data collection in community health centers. S and KAE supervised the methodological process and interpretation of findings. N and ANM performed data checking and prepared the initial manuscript draft. All authors critically reviewed the manuscript, approved the final version for submission, and agreed to be accountable for the accuracy and integrity of the work.</w:t>
       </w:r>
     </w:p>
     <w:p>
@@ -3972,10 +3729,7 @@
         <w:jc w:val="both"/>
       </w:pPr>
       <w:r>
-        <w:t>The authors thank the participating community health centers in Kendari and all patients who took part in this study. The authors also acknowledge the health care professionals who contri</w:t>
-      </w:r>
-      <w:r>
-        <w:t>buted to the content validity assessment of the instrument.</w:t>
+        <w:t>The authors thank the participating community health centers in Kendari and all patients who took part in this study. The authors also acknowledge the health care professionals who contributed to the content validity assessment of the instrument.</w:t>
       </w:r>
     </w:p>
     <w:p>
@@ -4055,10 +3809,7 @@
         <w:jc w:val="both"/>
       </w:pPr>
       <w:r>
-        <w:t xml:space="preserve">World </w:t>
-      </w:r>
-      <w:r>
-        <w:t>Health Organization. Diabetes fact sheet. Geneva: WHO; 2024.</w:t>
+        <w:t>World Health Organization. Diabetes fact sheet. Geneva: WHO; 2024.</w:t>
       </w:r>
     </w:p>
     <w:p>
@@ -4086,10 +3837,7 @@
         <w:jc w:val="both"/>
       </w:pPr>
       <w:r>
-        <w:t>Bus SA, Armstrong DG, Gooday C, Jarl G, Caravaggi C, Viswanathan V, et al. Guide</w:t>
-      </w:r>
-      <w:r>
-        <w:t>lines on the prevention of foot ulcers in persons with diabetes. Diabetes Metab Res Rev 2023; 39(S1): e3624.</w:t>
+        <w:t>Bus SA, Armstrong DG, Gooday C, Jarl G, Caravaggi C, Viswanathan V, et al. Guidelines on the prevention of foot ulcers in persons with diabetes. Diabetes Metab Res Rev 2023; 39(S1): e3624.</w:t>
       </w:r>
     </w:p>
     <w:p>
@@ -4103,10 +3851,7 @@
         <w:jc w:val="both"/>
       </w:pPr>
       <w:r>
-        <w:t>Zhang Y, Lazzarini PA, McPhail SM, van Netten JJ, Armstrong DG, Pacella RE. Global disability burdens of diabetes-related lower-extremity complicat</w:t>
-      </w:r>
-      <w:r>
-        <w:t>ions in 1990 and 2016. Diabetes Care 2020; 43(5): 964-74.</w:t>
+        <w:t>Zhang Y, Lazzarini PA, McPhail SM, van Netten JJ, Armstrong DG, Pacella RE. Global disability burdens of diabetes-related lower-extremity complications in 1990 and 2016. Diabetes Care 2020; 43(5): 964-74.</w:t>
       </w:r>
     </w:p>
     <w:p>
@@ -4147,10 +3892,7 @@
         <w:jc w:val="both"/>
       </w:pPr>
       <w:r>
-        <w:t>Committee ADAPP, ElSa</w:t>
-      </w:r>
-      <w:r>
-        <w:t>yed NA, McCoy RG, Aleppo G, Balapattabi K, Beverly EA, et al. Retinopathy, neuropathy, and foot care: Standards of Care in Diabetes-2025. Diabetes Care 2025; 48(Suppl 1): S252-65.</w:t>
+        <w:t>Committee ADAPP, ElSayed NA, McCoy RG, Aleppo G, Balapattabi K, Beverly EA, et al. Retinopathy, neuropathy, and foot care: Standards of Care in Diabetes-2025. Diabetes Care 2025; 48(Suppl 1): S252-65.</w:t>
       </w:r>
     </w:p>
     <w:p>
@@ -4165,10 +3907,7 @@
       </w:pPr>
       <w:r>
         <w:lastRenderedPageBreak/>
-        <w:t>Lecker L, Stevens M, Thienel F, Lazovic D, van den Akker-Scheek I, Seeber GH</w:t>
-      </w:r>
-      <w:r>
-        <w:t>. Validity and reliability of the German translation of the Diabetes Foot Self-Care Behavior Scale. PLoS One 2022; 17(6): e0269395.</w:t>
+        <w:t>Lecker L, Stevens M, Thienel F, Lazovic D, van den Akker-Scheek I, Seeber GH. Validity and reliability of the German translation of the Diabetes Foot Self-Care Behavior Scale. PLoS One 2022; 17(6): e0269395.</w:t>
       </w:r>
     </w:p>
     <w:p>
@@ -4182,10 +3921,7 @@
         <w:jc w:val="both"/>
       </w:pPr>
       <w:r>
-        <w:t>Mahmoodi H, Abdi K, Navarro-Flores E, Karimi Z, Sharif Nia H, Gheshlagh RG. Psychometric evaluation of the Persian version o</w:t>
-      </w:r>
-      <w:r>
-        <w:t>f the diabetic foot self-care questionnaire in Iranian patients with diabetes. BMC Endocr Disord 2021; 21(1): 72.</w:t>
+        <w:t>Mahmoodi H, Abdi K, Navarro-Flores E, Karimi Z, Sharif Nia H, Gheshlagh RG. Psychometric evaluation of the Persian version of the diabetic foot self-care questionnaire in Iranian patients with diabetes. BMC Endocr Disord 2021; 21(1): 72.</w:t>
       </w:r>
     </w:p>
     <w:p>
@@ -4199,10 +3935,7 @@
         <w:jc w:val="both"/>
       </w:pPr>
       <w:r>
-        <w:t xml:space="preserve">Guerra E del PH, Arellanos LRB. Design and validation of a self-care evaluation instrument to prevent diabetic foot. Invest Educ Enferm 2022; </w:t>
-      </w:r>
-      <w:r>
-        <w:t>40(2): e06.</w:t>
+        <w:t>Guerra E del PH, Arellanos LRB. Design and validation of a self-care evaluation instrument to prevent diabetic foot. Invest Educ Enferm 2022; 40(2): e06.</w:t>
       </w:r>
     </w:p>
     <w:p>
@@ -4230,10 +3963,7 @@
         <w:jc w:val="both"/>
       </w:pPr>
       <w:r>
-        <w:t xml:space="preserve">Hagger MS, Hamilton K. Progress on theory of planned behavior research: advances in research synthesis and agenda for future research. J Behav Med </w:t>
-      </w:r>
-      <w:r>
-        <w:t>2025; 48(1): 43-56.</w:t>
+        <w:t>Hagger MS, Hamilton K. Progress on theory of planned behavior research: advances in research synthesis and agenda for future research. J Behav Med 2025; 48(1): 43-56.</w:t>
       </w:r>
     </w:p>
     <w:p>
@@ -4247,10 +3977,7 @@
         <w:jc w:val="both"/>
       </w:pPr>
       <w:r>
-        <w:t>Pezeshki B, Orangi S, Kashfi S, Afzali Harsini P, Mohammadkhah F, Khani Jeihooni A. Effect of an educational intervention based on the Theory of Planned Behaviour in type 2 diabetic patients at a foot and eye care practice. J Endocrinol</w:t>
-      </w:r>
-      <w:r>
-        <w:t xml:space="preserve"> Metab Diabetes S Afr 2023; 28(3): 105-10.</w:t>
+        <w:t>Pezeshki B, Orangi S, Kashfi S, Afzali Harsini P, Mohammadkhah F, Khani Jeihooni A. Effect of an educational intervention based on the Theory of Planned Behaviour in type 2 diabetic patients at a foot and eye care practice. J Endocrinol Metab Diabetes S Afr 2023; 28(3): 105-10.</w:t>
       </w:r>
     </w:p>
     <w:p>
@@ -4291,10 +4018,7 @@
         <w:jc w:val="both"/>
       </w:pPr>
       <w:r>
-        <w:t>Polit DF, B</w:t>
-      </w:r>
-      <w:r>
-        <w:t>eck CT. The content validity index: are you sure you know what is being reported? Critique and recommendations. Res Nurs Health 2006; 29(5): 489-97.</w:t>
+        <w:t>Polit DF, Beck CT. The content validity index: are you sure you know what is being reported? Critique and recommendations. Res Nurs Health 2006; 29(5): 489-97.</w:t>
       </w:r>
     </w:p>
     <w:p>
@@ -4308,10 +4032,7 @@
         <w:jc w:val="both"/>
       </w:pPr>
       <w:r>
-        <w:t>Yusoff MSB. ABC of content validation and content validity index calculation. Educ Med J 2019; 11(2): 49-54</w:t>
-      </w:r>
-      <w:r>
-        <w:t>.</w:t>
+        <w:t>Yusoff MSB. ABC of content validation and content validity index calculation. Educ Med J 2019; 11(2): 49-54.</w:t>
       </w:r>
     </w:p>
     <w:p>
@@ -4330,15 +4051,7 @@
       </w:r>
       <w:proofErr w:type="spellEnd"/>
       <w:r>
-        <w:t xml:space="preserve"> M, </w:t>
-      </w:r>
-      <w:proofErr w:type="spellStart"/>
-      <w:r>
-        <w:t>Dennick</w:t>
-      </w:r>
-      <w:proofErr w:type="spellEnd"/>
-      <w:r>
-        <w:t xml:space="preserve"> R. Making sense of Cronbach's alpha. Int J Med Educ 2011; 2: 53-5.</w:t>
+        <w:t xml:space="preserve"> M, Dennick R. Making sense of Cronbach's alpha. Int J Med Educ 2011; 2: 53-5.</w:t>
       </w:r>
     </w:p>
     <w:p>
@@ -4352,10 +4065,7 @@
         <w:jc w:val="both"/>
       </w:pPr>
       <w:r>
-        <w:t>Qiao X, Ji L, Jin Y, Si H, Bian Y, Wang W, et al. Development and validation of an instrument to measure beliefs in physical activity among prefrail older adults. Patie</w:t>
-      </w:r>
-      <w:r>
-        <w:t>nt Educ Couns 2021; 104(10): 2544-51.</w:t>
+        <w:t>Qiao X, Ji L, Jin Y, Si H, Bian Y, Wang W, et al. Development and validation of an instrument to measure beliefs in physical activity among prefrail older adults. Patient Educ Couns 2021; 104(10): 2544-51.</w:t>
       </w:r>
     </w:p>
     <w:p>
@@ -4383,10 +4093,7 @@
         <w:jc w:val="both"/>
       </w:pPr>
       <w:r>
-        <w:t>Navarro</w:t>
-      </w:r>
-      <w:r>
-        <w:t>-Flores E, Losa-Iglesias ME, Becerro-de-Bengoa-Vallejo R, Jimenez-Cebrian AM, Rochdi L, Romero-Morales C, et al. Repeatability and reliability of the diabetic foot self-care questionnaire in Arabic patients. J Tissue Viability 2022; 31(1): 62-8.</w:t>
+        <w:t>Navarro-Flores E, Losa-Iglesias ME, Becerro-de-Bengoa-Vallejo R, Jimenez-Cebrian AM, Rochdi L, Romero-Morales C, et al. Repeatability and reliability of the diabetic foot self-care questionnaire in Arabic patients. J Tissue Viability 2022; 31(1): 62-8.</w:t>
       </w:r>
     </w:p>
     <w:p>
@@ -4401,10 +4108,7 @@
       </w:pPr>
       <w:r>
         <w:lastRenderedPageBreak/>
-        <w:t>Ruiz-Munoz</w:t>
-      </w:r>
-      <w:r>
-        <w:t xml:space="preserve"> M, Fernandez-Torres R, Formosa C, Gatt A, Gijon-Nogueron G, Navarro-Flores E, et al. Validity and reliability of the English version of the Diabetic Foot Self-Care Questionnaire. Front Public Health 2023; 11: 1326439.</w:t>
+        <w:t>Ruiz-Munoz M, Fernandez-Torres R, Formosa C, Gatt A, Gijon-Nogueron G, Navarro-Flores E, et al. Validity and reliability of the English version of the Diabetic Foot Self-Care Questionnaire. Front Public Health 2023; 11: 1326439.</w:t>
       </w:r>
     </w:p>
     <w:sectPr>
@@ -4424,7 +4128,7 @@
 </file>
 
 <file path=word/endnotes.xml><?xml version="1.0" encoding="utf-8"?>
-<w:endnotes xmlns:wpc="http://schemas.microsoft.com/office/word/2010/wordprocessingCanvas" xmlns:cx="http://schemas.microsoft.com/office/drawing/2014/chartex" xmlns:cx1="http://schemas.microsoft.com/office/drawing/2015/9/8/chartex" xmlns:cx2="http://schemas.microsoft.com/office/drawing/2015/10/21/chartex" xmlns:cx3="http://schemas.microsoft.com/office/drawing/2016/5/9/chartex" xmlns:cx4="http://schemas.microsoft.com/office/drawing/2016/5/10/chartex" xmlns:cx5="http://schemas.microsoft.com/office/drawing/2016/5/11/chartex" xmlns:cx6="http://schemas.microsoft.com/office/drawing/2016/5/12/chartex" xmlns:cx7="http://schemas.microsoft.com/office/drawing/2016/5/13/chartex" xmlns:cx8="http://schemas.microsoft.com/office/drawing/2016/5/14/chartex" xmlns:mc="http://schemas.openxmlformats.org/markup-compatibility/2006" xmlns:aink="http://schemas.microsoft.com/office/drawing/2016/ink" xmlns:am3d="http://schemas.microsoft.com/office/drawing/2017/model3d" xmlns:o="urn:schemas-microsoft-com:office:office" xmlns:r="http://schemas.openxmlformats.org/officeDocument/2006/relationships" xmlns:m="http://schemas.openxmlformats.org/officeDocument/2006/math" xmlns:v="urn:schemas-microsoft-com:vml" xmlns:wp14="http://schemas.microsoft.com/office/word/2010/wordprocessingDrawing" xmlns:wp="http://schemas.openxmlformats.org/drawingml/2006/wordprocessingDrawing" xmlns:w10="urn:schemas-microsoft-com:office:word" xmlns:w="http://schemas.openxmlformats.org/wordprocessingml/2006/main" xmlns:w14="http://schemas.microsoft.com/office/word/2010/wordml" xmlns:w15="http://schemas.microsoft.com/office/word/2012/wordml" xmlns:w16cex="http://schemas.microsoft.com/office/word/2018/wordml/cex" xmlns:w16cid="http://schemas.microsoft.com/office/word/2016/wordml/cid" xmlns:w16="http://schemas.microsoft.com/office/word/2018/wordml" xmlns:w16sdtdh="http://schemas.microsoft.com/office/word/2020/wordml/sdtdatahash" xmlns:w16se="http://schemas.microsoft.com/office/word/2015/wordml/symex" xmlns:wpg="http://schemas.microsoft.com/office/word/2010/wordprocessingGroup" xmlns:wpi="http://schemas.microsoft.com/office/word/2010/wordprocessingInk" xmlns:wne="http://schemas.microsoft.com/office/word/2006/wordml" xmlns:wps="http://schemas.microsoft.com/office/word/2010/wordprocessingShape" mc:Ignorable="w14 w15 w16se w16cid w16 w16cex w16sdtdh wp14">
+<w:endnotes xmlns:wpc="http://schemas.microsoft.com/office/word/2010/wordprocessingCanvas" xmlns:cx="http://schemas.microsoft.com/office/drawing/2014/chartex" xmlns:cx1="http://schemas.microsoft.com/office/drawing/2015/9/8/chartex" xmlns:cx2="http://schemas.microsoft.com/office/drawing/2015/10/21/chartex" xmlns:cx3="http://schemas.microsoft.com/office/drawing/2016/5/9/chartex" xmlns:cx4="http://schemas.microsoft.com/office/drawing/2016/5/10/chartex" xmlns:cx5="http://schemas.microsoft.com/office/drawing/2016/5/11/chartex" xmlns:cx6="http://schemas.microsoft.com/office/drawing/2016/5/12/chartex" xmlns:cx7="http://schemas.microsoft.com/office/drawing/2016/5/13/chartex" xmlns:cx8="http://schemas.microsoft.com/office/drawing/2016/5/14/chartex" xmlns:mc="http://schemas.openxmlformats.org/markup-compatibility/2006" xmlns:aink="http://schemas.microsoft.com/office/drawing/2016/ink" xmlns:am3d="http://schemas.microsoft.com/office/drawing/2017/model3d" xmlns:o="urn:schemas-microsoft-com:office:office" xmlns:oel="http://schemas.microsoft.com/office/2019/extlst" xmlns:r="http://schemas.openxmlformats.org/officeDocument/2006/relationships" xmlns:m="http://schemas.openxmlformats.org/officeDocument/2006/math" xmlns:v="urn:schemas-microsoft-com:vml" xmlns:wp14="http://schemas.microsoft.com/office/word/2010/wordprocessingDrawing" xmlns:wp="http://schemas.openxmlformats.org/drawingml/2006/wordprocessingDrawing" xmlns:w10="urn:schemas-microsoft-com:office:word" xmlns:w="http://schemas.openxmlformats.org/wordprocessingml/2006/main" xmlns:w14="http://schemas.microsoft.com/office/word/2010/wordml" xmlns:w15="http://schemas.microsoft.com/office/word/2012/wordml" xmlns:w16cex="http://schemas.microsoft.com/office/word/2018/wordml/cex" xmlns:w16cid="http://schemas.microsoft.com/office/word/2016/wordml/cid" xmlns:w16="http://schemas.microsoft.com/office/word/2018/wordml" xmlns:w16du="http://schemas.microsoft.com/office/word/2023/wordml/word16du" xmlns:w16sdtdh="http://schemas.microsoft.com/office/word/2020/wordml/sdtdatahash" xmlns:w16sdtfl="http://schemas.microsoft.com/office/word/2024/wordml/sdtformatlock" xmlns:w16se="http://schemas.microsoft.com/office/word/2015/wordml/symex" xmlns:wpg="http://schemas.microsoft.com/office/word/2010/wordprocessingGroup" xmlns:wpi="http://schemas.microsoft.com/office/word/2010/wordprocessingInk" xmlns:wne="http://schemas.microsoft.com/office/word/2006/wordml" xmlns:wps="http://schemas.microsoft.com/office/word/2010/wordprocessingShape" mc:Ignorable="w14 w15 w16se w16cid w16 w16cex w16sdtdh w16sdtfl w16du wp14">
   <w:endnote w:type="separator" w:id="-1">
     <w:p>
       <w:r>
@@ -4443,7 +4147,7 @@
 </file>
 
 <file path=word/footer1.xml><?xml version="1.0" encoding="utf-8"?>
-<w:ftr xmlns:wpc="http://schemas.microsoft.com/office/word/2010/wordprocessingCanvas" xmlns:cx="http://schemas.microsoft.com/office/drawing/2014/chartex" xmlns:cx1="http://schemas.microsoft.com/office/drawing/2015/9/8/chartex" xmlns:cx2="http://schemas.microsoft.com/office/drawing/2015/10/21/chartex" xmlns:cx3="http://schemas.microsoft.com/office/drawing/2016/5/9/chartex" xmlns:cx4="http://schemas.microsoft.com/office/drawing/2016/5/10/chartex" xmlns:cx5="http://schemas.microsoft.com/office/drawing/2016/5/11/chartex" xmlns:cx6="http://schemas.microsoft.com/office/drawing/2016/5/12/chartex" xmlns:cx7="http://schemas.microsoft.com/office/drawing/2016/5/13/chartex" xmlns:cx8="http://schemas.microsoft.com/office/drawing/2016/5/14/chartex" xmlns:mc="http://schemas.openxmlformats.org/markup-compatibility/2006" xmlns:aink="http://schemas.microsoft.com/office/drawing/2016/ink" xmlns:am3d="http://schemas.microsoft.com/office/drawing/2017/model3d" xmlns:o="urn:schemas-microsoft-com:office:office" xmlns:r="http://schemas.openxmlformats.org/officeDocument/2006/relationships" xmlns:m="http://schemas.openxmlformats.org/officeDocument/2006/math" xmlns:v="urn:schemas-microsoft-com:vml" xmlns:wp14="http://schemas.microsoft.com/office/word/2010/wordprocessingDrawing" xmlns:wp="http://schemas.openxmlformats.org/drawingml/2006/wordprocessingDrawing" xmlns:w10="urn:schemas-microsoft-com:office:word" xmlns:w="http://schemas.openxmlformats.org/wordprocessingml/2006/main" xmlns:w14="http://schemas.microsoft.com/office/word/2010/wordml" xmlns:w15="http://schemas.microsoft.com/office/word/2012/wordml" xmlns:w16cex="http://schemas.microsoft.com/office/word/2018/wordml/cex" xmlns:w16cid="http://schemas.microsoft.com/office/word/2016/wordml/cid" xmlns:w16="http://schemas.microsoft.com/office/word/2018/wordml" xmlns:w16sdtdh="http://schemas.microsoft.com/office/word/2020/wordml/sdtdatahash" xmlns:w16se="http://schemas.microsoft.com/office/word/2015/wordml/symex" xmlns:wpg="http://schemas.microsoft.com/office/word/2010/wordprocessingGroup" xmlns:wpi="http://schemas.microsoft.com/office/word/2010/wordprocessingInk" xmlns:wne="http://schemas.microsoft.com/office/word/2006/wordml" xmlns:wps="http://schemas.microsoft.com/office/word/2010/wordprocessingShape" mc:Ignorable="w14 w15 w16se w16cid w16 w16cex w16sdtdh wp14">
+<w:ftr xmlns:wpc="http://schemas.microsoft.com/office/word/2010/wordprocessingCanvas" xmlns:cx="http://schemas.microsoft.com/office/drawing/2014/chartex" xmlns:cx1="http://schemas.microsoft.com/office/drawing/2015/9/8/chartex" xmlns:cx2="http://schemas.microsoft.com/office/drawing/2015/10/21/chartex" xmlns:cx3="http://schemas.microsoft.com/office/drawing/2016/5/9/chartex" xmlns:cx4="http://schemas.microsoft.com/office/drawing/2016/5/10/chartex" xmlns:cx5="http://schemas.microsoft.com/office/drawing/2016/5/11/chartex" xmlns:cx6="http://schemas.microsoft.com/office/drawing/2016/5/12/chartex" xmlns:cx7="http://schemas.microsoft.com/office/drawing/2016/5/13/chartex" xmlns:cx8="http://schemas.microsoft.com/office/drawing/2016/5/14/chartex" xmlns:mc="http://schemas.openxmlformats.org/markup-compatibility/2006" xmlns:aink="http://schemas.microsoft.com/office/drawing/2016/ink" xmlns:am3d="http://schemas.microsoft.com/office/drawing/2017/model3d" xmlns:o="urn:schemas-microsoft-com:office:office" xmlns:oel="http://schemas.microsoft.com/office/2019/extlst" xmlns:r="http://schemas.openxmlformats.org/officeDocument/2006/relationships" xmlns:m="http://schemas.openxmlformats.org/officeDocument/2006/math" xmlns:v="urn:schemas-microsoft-com:vml" xmlns:wp14="http://schemas.microsoft.com/office/word/2010/wordprocessingDrawing" xmlns:wp="http://schemas.openxmlformats.org/drawingml/2006/wordprocessingDrawing" xmlns:w10="urn:schemas-microsoft-com:office:word" xmlns:w="http://schemas.openxmlformats.org/wordprocessingml/2006/main" xmlns:w14="http://schemas.microsoft.com/office/word/2010/wordml" xmlns:w15="http://schemas.microsoft.com/office/word/2012/wordml" xmlns:w16cex="http://schemas.microsoft.com/office/word/2018/wordml/cex" xmlns:w16cid="http://schemas.microsoft.com/office/word/2016/wordml/cid" xmlns:w16="http://schemas.microsoft.com/office/word/2018/wordml" xmlns:w16du="http://schemas.microsoft.com/office/word/2023/wordml/word16du" xmlns:w16sdtdh="http://schemas.microsoft.com/office/word/2020/wordml/sdtdatahash" xmlns:w16sdtfl="http://schemas.microsoft.com/office/word/2024/wordml/sdtformatlock" xmlns:w16se="http://schemas.microsoft.com/office/word/2015/wordml/symex" xmlns:wpg="http://schemas.microsoft.com/office/word/2010/wordprocessingGroup" xmlns:wpi="http://schemas.microsoft.com/office/word/2010/wordprocessingInk" xmlns:wne="http://schemas.microsoft.com/office/word/2006/wordml" xmlns:wps="http://schemas.microsoft.com/office/word/2010/wordprocessingShape" mc:Ignorable="w14 w15 w16se w16cid w16 w16cex w16sdtdh w16sdtfl w16du wp14">
   <w:p>
     <w:pPr>
       <w:pStyle w:val="Footer"/>
@@ -4750,7 +4454,7 @@
         </mc:Choice>
         <mc:Fallback>
           <w:pict>
-            <v:group w14:anchorId="06676696" id="Group 40" o:spid="_x0000_s1030" style="position:absolute;margin-left:-72.1pt;margin-top:-39.65pt;width:546.05pt;height:53.6pt;z-index:251669504" coordsize="69348,6809" o:gfxdata="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">
+            <v:group w14:anchorId="06676696" id="Group 40" o:spid="_x0000_s1030" style="position:absolute;margin-left:-72.1pt;margin-top:-39.65pt;width:546.05pt;height:53.6pt;z-index:251669504" coordsize="69348,6809" o:gfxdata="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">
               <v:rect id="Rectangle 41" o:spid="_x0000_s1031" style="position:absolute;left:9290;top:2414;width:59245;height:952;visibility:visible;mso-wrap-style:square;v-text-anchor:middle" o:gfxdata="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" fillcolor="#0035ad" stroked="f" strokeweight="1pt"/>
               <v:shapetype id="_x0000_t202" coordsize="21600,21600" o:spt="202" path="m,l,21600r21600,l21600,xe">
                 <v:stroke joinstyle="miter"/>
@@ -4839,7 +4543,7 @@
 </file>
 
 <file path=word/footer2.xml><?xml version="1.0" encoding="utf-8"?>
-<w:ftr xmlns:wpc="http://schemas.microsoft.com/office/word/2010/wordprocessingCanvas" xmlns:cx="http://schemas.microsoft.com/office/drawing/2014/chartex" xmlns:cx1="http://schemas.microsoft.com/office/drawing/2015/9/8/chartex" xmlns:cx2="http://schemas.microsoft.com/office/drawing/2015/10/21/chartex" xmlns:cx3="http://schemas.microsoft.com/office/drawing/2016/5/9/chartex" xmlns:cx4="http://schemas.microsoft.com/office/drawing/2016/5/10/chartex" xmlns:cx5="http://schemas.microsoft.com/office/drawing/2016/5/11/chartex" xmlns:cx6="http://schemas.microsoft.com/office/drawing/2016/5/12/chartex" xmlns:cx7="http://schemas.microsoft.com/office/drawing/2016/5/13/chartex" xmlns:cx8="http://schemas.microsoft.com/office/drawing/2016/5/14/chartex" xmlns:mc="http://schemas.openxmlformats.org/markup-compatibility/2006" xmlns:aink="http://schemas.microsoft.com/office/drawing/2016/ink" xmlns:am3d="http://schemas.microsoft.com/office/drawing/2017/model3d" xmlns:o="urn:schemas-microsoft-com:office:office" xmlns:r="http://schemas.openxmlformats.org/officeDocument/2006/relationships" xmlns:m="http://schemas.openxmlformats.org/officeDocument/2006/math" xmlns:v="urn:schemas-microsoft-com:vml" xmlns:wp14="http://schemas.microsoft.com/office/word/2010/wordprocessingDrawing" xmlns:wp="http://schemas.openxmlformats.org/drawingml/2006/wordprocessingDrawing" xmlns:w10="urn:schemas-microsoft-com:office:word" xmlns:w="http://schemas.openxmlformats.org/wordprocessingml/2006/main" xmlns:w14="http://schemas.microsoft.com/office/word/2010/wordml" xmlns:w15="http://schemas.microsoft.com/office/word/2012/wordml" xmlns:w16cex="http://schemas.microsoft.com/office/word/2018/wordml/cex" xmlns:w16cid="http://schemas.microsoft.com/office/word/2016/wordml/cid" xmlns:w16="http://schemas.microsoft.com/office/word/2018/wordml" xmlns:w16sdtdh="http://schemas.microsoft.com/office/word/2020/wordml/sdtdatahash" xmlns:w16se="http://schemas.microsoft.com/office/word/2015/wordml/symex" xmlns:wpg="http://schemas.microsoft.com/office/word/2010/wordprocessingGroup" xmlns:wpi="http://schemas.microsoft.com/office/word/2010/wordprocessingInk" xmlns:wne="http://schemas.microsoft.com/office/word/2006/wordml" xmlns:wps="http://schemas.microsoft.com/office/word/2010/wordprocessingShape" mc:Ignorable="w14 w15 w16se w16cid w16 w16cex w16sdtdh wp14">
+<w:ftr xmlns:wpc="http://schemas.microsoft.com/office/word/2010/wordprocessingCanvas" xmlns:cx="http://schemas.microsoft.com/office/drawing/2014/chartex" xmlns:cx1="http://schemas.microsoft.com/office/drawing/2015/9/8/chartex" xmlns:cx2="http://schemas.microsoft.com/office/drawing/2015/10/21/chartex" xmlns:cx3="http://schemas.microsoft.com/office/drawing/2016/5/9/chartex" xmlns:cx4="http://schemas.microsoft.com/office/drawing/2016/5/10/chartex" xmlns:cx5="http://schemas.microsoft.com/office/drawing/2016/5/11/chartex" xmlns:cx6="http://schemas.microsoft.com/office/drawing/2016/5/12/chartex" xmlns:cx7="http://schemas.microsoft.com/office/drawing/2016/5/13/chartex" xmlns:cx8="http://schemas.microsoft.com/office/drawing/2016/5/14/chartex" xmlns:mc="http://schemas.openxmlformats.org/markup-compatibility/2006" xmlns:aink="http://schemas.microsoft.com/office/drawing/2016/ink" xmlns:am3d="http://schemas.microsoft.com/office/drawing/2017/model3d" xmlns:o="urn:schemas-microsoft-com:office:office" xmlns:oel="http://schemas.microsoft.com/office/2019/extlst" xmlns:r="http://schemas.openxmlformats.org/officeDocument/2006/relationships" xmlns:m="http://schemas.openxmlformats.org/officeDocument/2006/math" xmlns:v="urn:schemas-microsoft-com:vml" xmlns:wp14="http://schemas.microsoft.com/office/word/2010/wordprocessingDrawing" xmlns:wp="http://schemas.openxmlformats.org/drawingml/2006/wordprocessingDrawing" xmlns:w10="urn:schemas-microsoft-com:office:word" xmlns:w="http://schemas.openxmlformats.org/wordprocessingml/2006/main" xmlns:w14="http://schemas.microsoft.com/office/word/2010/wordml" xmlns:w15="http://schemas.microsoft.com/office/word/2012/wordml" xmlns:w16cex="http://schemas.microsoft.com/office/word/2018/wordml/cex" xmlns:w16cid="http://schemas.microsoft.com/office/word/2016/wordml/cid" xmlns:w16="http://schemas.microsoft.com/office/word/2018/wordml" xmlns:w16du="http://schemas.microsoft.com/office/word/2023/wordml/word16du" xmlns:w16sdtdh="http://schemas.microsoft.com/office/word/2020/wordml/sdtdatahash" xmlns:w16sdtfl="http://schemas.microsoft.com/office/word/2024/wordml/sdtformatlock" xmlns:w16se="http://schemas.microsoft.com/office/word/2015/wordml/symex" xmlns:wpg="http://schemas.microsoft.com/office/word/2010/wordprocessingGroup" xmlns:wpi="http://schemas.microsoft.com/office/word/2010/wordprocessingInk" xmlns:wne="http://schemas.microsoft.com/office/word/2006/wordml" xmlns:wps="http://schemas.microsoft.com/office/word/2010/wordprocessingShape" mc:Ignorable="w14 w15 w16se w16cid w16 w16cex w16sdtdh w16sdtfl w16du wp14">
   <w:p>
     <w:pPr>
       <w:pStyle w:val="Footer"/>
@@ -5146,7 +4850,7 @@
         </mc:Choice>
         <mc:Fallback>
           <w:pict>
-            <v:group w14:anchorId="269A70FA" id="Group 51" o:spid="_x0000_s1036" style="position:absolute;margin-left:-71.9pt;margin-top:-39.75pt;width:546.05pt;height:53.6pt;z-index:251673600" coordsize="69348,6809" o:gfxdata="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">
+            <v:group w14:anchorId="269A70FA" id="Group 51" o:spid="_x0000_s1036" style="position:absolute;margin-left:-71.9pt;margin-top:-39.75pt;width:546.05pt;height:53.6pt;z-index:251673600" coordsize="69348,6809" o:gfxdata="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">
               <v:rect id="Rectangle 52" o:spid="_x0000_s1037" style="position:absolute;left:9290;top:2414;width:59245;height:952;visibility:visible;mso-wrap-style:square;v-text-anchor:middle" o:gfxdata="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" fillcolor="#0035ad" stroked="f" strokeweight="1pt"/>
               <v:shapetype id="_x0000_t202" coordsize="21600,21600" o:spt="202" path="m,l,21600r21600,l21600,xe">
                 <v:stroke joinstyle="miter"/>
@@ -5235,7 +4939,7 @@
 </file>
 
 <file path=word/footer3.xml><?xml version="1.0" encoding="utf-8"?>
-<w:ftr xmlns:wpc="http://schemas.microsoft.com/office/word/2010/wordprocessingCanvas" xmlns:cx="http://schemas.microsoft.com/office/drawing/2014/chartex" xmlns:cx1="http://schemas.microsoft.com/office/drawing/2015/9/8/chartex" xmlns:cx2="http://schemas.microsoft.com/office/drawing/2015/10/21/chartex" xmlns:cx3="http://schemas.microsoft.com/office/drawing/2016/5/9/chartex" xmlns:cx4="http://schemas.microsoft.com/office/drawing/2016/5/10/chartex" xmlns:cx5="http://schemas.microsoft.com/office/drawing/2016/5/11/chartex" xmlns:cx6="http://schemas.microsoft.com/office/drawing/2016/5/12/chartex" xmlns:cx7="http://schemas.microsoft.com/office/drawing/2016/5/13/chartex" xmlns:cx8="http://schemas.microsoft.com/office/drawing/2016/5/14/chartex" xmlns:mc="http://schemas.openxmlformats.org/markup-compatibility/2006" xmlns:aink="http://schemas.microsoft.com/office/drawing/2016/ink" xmlns:am3d="http://schemas.microsoft.com/office/drawing/2017/model3d" xmlns:o="urn:schemas-microsoft-com:office:office" xmlns:r="http://schemas.openxmlformats.org/officeDocument/2006/relationships" xmlns:m="http://schemas.openxmlformats.org/officeDocument/2006/math" xmlns:v="urn:schemas-microsoft-com:vml" xmlns:wp14="http://schemas.microsoft.com/office/word/2010/wordprocessingDrawing" xmlns:wp="http://schemas.openxmlformats.org/drawingml/2006/wordprocessingDrawing" xmlns:w10="urn:schemas-microsoft-com:office:word" xmlns:w="http://schemas.openxmlformats.org/wordprocessingml/2006/main" xmlns:w14="http://schemas.microsoft.com/office/word/2010/wordml" xmlns:w15="http://schemas.microsoft.com/office/word/2012/wordml" xmlns:w16cex="http://schemas.microsoft.com/office/word/2018/wordml/cex" xmlns:w16cid="http://schemas.microsoft.com/office/word/2016/wordml/cid" xmlns:w16="http://schemas.microsoft.com/office/word/2018/wordml" xmlns:w16sdtdh="http://schemas.microsoft.com/office/word/2020/wordml/sdtdatahash" xmlns:w16se="http://schemas.microsoft.com/office/word/2015/wordml/symex" xmlns:wpg="http://schemas.microsoft.com/office/word/2010/wordprocessingGroup" xmlns:wpi="http://schemas.microsoft.com/office/word/2010/wordprocessingInk" xmlns:wne="http://schemas.microsoft.com/office/word/2006/wordml" xmlns:wps="http://schemas.microsoft.com/office/word/2010/wordprocessingShape" mc:Ignorable="w14 w15 w16se w16cid w16 w16cex w16sdtdh wp14">
+<w:ftr xmlns:wpc="http://schemas.microsoft.com/office/word/2010/wordprocessingCanvas" xmlns:cx="http://schemas.microsoft.com/office/drawing/2014/chartex" xmlns:cx1="http://schemas.microsoft.com/office/drawing/2015/9/8/chartex" xmlns:cx2="http://schemas.microsoft.com/office/drawing/2015/10/21/chartex" xmlns:cx3="http://schemas.microsoft.com/office/drawing/2016/5/9/chartex" xmlns:cx4="http://schemas.microsoft.com/office/drawing/2016/5/10/chartex" xmlns:cx5="http://schemas.microsoft.com/office/drawing/2016/5/11/chartex" xmlns:cx6="http://schemas.microsoft.com/office/drawing/2016/5/12/chartex" xmlns:cx7="http://schemas.microsoft.com/office/drawing/2016/5/13/chartex" xmlns:cx8="http://schemas.microsoft.com/office/drawing/2016/5/14/chartex" xmlns:mc="http://schemas.openxmlformats.org/markup-compatibility/2006" xmlns:aink="http://schemas.microsoft.com/office/drawing/2016/ink" xmlns:am3d="http://schemas.microsoft.com/office/drawing/2017/model3d" xmlns:o="urn:schemas-microsoft-com:office:office" xmlns:oel="http://schemas.microsoft.com/office/2019/extlst" xmlns:r="http://schemas.openxmlformats.org/officeDocument/2006/relationships" xmlns:m="http://schemas.openxmlformats.org/officeDocument/2006/math" xmlns:v="urn:schemas-microsoft-com:vml" xmlns:wp14="http://schemas.microsoft.com/office/word/2010/wordprocessingDrawing" xmlns:wp="http://schemas.openxmlformats.org/drawingml/2006/wordprocessingDrawing" xmlns:w10="urn:schemas-microsoft-com:office:word" xmlns:w="http://schemas.openxmlformats.org/wordprocessingml/2006/main" xmlns:w14="http://schemas.microsoft.com/office/word/2010/wordml" xmlns:w15="http://schemas.microsoft.com/office/word/2012/wordml" xmlns:w16cex="http://schemas.microsoft.com/office/word/2018/wordml/cex" xmlns:w16cid="http://schemas.microsoft.com/office/word/2016/wordml/cid" xmlns:w16="http://schemas.microsoft.com/office/word/2018/wordml" xmlns:w16du="http://schemas.microsoft.com/office/word/2023/wordml/word16du" xmlns:w16sdtdh="http://schemas.microsoft.com/office/word/2020/wordml/sdtdatahash" xmlns:w16sdtfl="http://schemas.microsoft.com/office/word/2024/wordml/sdtformatlock" xmlns:w16se="http://schemas.microsoft.com/office/word/2015/wordml/symex" xmlns:wpg="http://schemas.microsoft.com/office/word/2010/wordprocessingGroup" xmlns:wpi="http://schemas.microsoft.com/office/word/2010/wordprocessingInk" xmlns:wne="http://schemas.microsoft.com/office/word/2006/wordml" xmlns:wps="http://schemas.microsoft.com/office/word/2010/wordprocessingShape" mc:Ignorable="w14 w15 w16se w16cid w16 w16cex w16sdtdh w16sdtfl w16du wp14">
   <w:p>
     <w:pPr>
       <w:pStyle w:val="Footer"/>
@@ -5546,7 +5250,7 @@
         </mc:Choice>
         <mc:Fallback>
           <w:pict>
-            <v:group w14:anchorId="44855C0D" id="Group 20" o:spid="_x0000_s1047" style="position:absolute;margin-left:-72.15pt;margin-top:-39.6pt;width:546.05pt;height:53.6pt;z-index:251660288" coordsize="69348,6809" o:gfxdata="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">
+            <v:group w14:anchorId="44855C0D" id="Group 20" o:spid="_x0000_s1047" style="position:absolute;margin-left:-72.15pt;margin-top:-39.6pt;width:546.05pt;height:53.6pt;z-index:251660288" coordsize="69348,6809" o:gfxdata="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">
               <v:rect id="Rectangle 21" o:spid="_x0000_s1048" style="position:absolute;left:9290;top:2414;width:59245;height:952;visibility:visible;mso-wrap-style:square;v-text-anchor:middle" o:gfxdata="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" fillcolor="#0035ad" stroked="f" strokeweight="1pt"/>
               <v:shapetype id="_x0000_t202" coordsize="21600,21600" o:spt="202" path="m,l,21600r21600,l21600,xe">
                 <v:stroke joinstyle="miter"/>
@@ -5639,7 +5343,7 @@
 </file>
 
 <file path=word/footnotes.xml><?xml version="1.0" encoding="utf-8"?>
-<w:footnotes xmlns:wpc="http://schemas.microsoft.com/office/word/2010/wordprocessingCanvas" xmlns:cx="http://schemas.microsoft.com/office/drawing/2014/chartex" xmlns:cx1="http://schemas.microsoft.com/office/drawing/2015/9/8/chartex" xmlns:cx2="http://schemas.microsoft.com/office/drawing/2015/10/21/chartex" xmlns:cx3="http://schemas.microsoft.com/office/drawing/2016/5/9/chartex" xmlns:cx4="http://schemas.microsoft.com/office/drawing/2016/5/10/chartex" xmlns:cx5="http://schemas.microsoft.com/office/drawing/2016/5/11/chartex" xmlns:cx6="http://schemas.microsoft.com/office/drawing/2016/5/12/chartex" xmlns:cx7="http://schemas.microsoft.com/office/drawing/2016/5/13/chartex" xmlns:cx8="http://schemas.microsoft.com/office/drawing/2016/5/14/chartex" xmlns:mc="http://schemas.openxmlformats.org/markup-compatibility/2006" xmlns:aink="http://schemas.microsoft.com/office/drawing/2016/ink" xmlns:am3d="http://schemas.microsoft.com/office/drawing/2017/model3d" xmlns:o="urn:schemas-microsoft-com:office:office" xmlns:r="http://schemas.openxmlformats.org/officeDocument/2006/relationships" xmlns:m="http://schemas.openxmlformats.org/officeDocument/2006/math" xmlns:v="urn:schemas-microsoft-com:vml" xmlns:wp14="http://schemas.microsoft.com/office/word/2010/wordprocessingDrawing" xmlns:wp="http://schemas.openxmlformats.org/drawingml/2006/wordprocessingDrawing" xmlns:w10="urn:schemas-microsoft-com:office:word" xmlns:w="http://schemas.openxmlformats.org/wordprocessingml/2006/main" xmlns:w14="http://schemas.microsoft.com/office/word/2010/wordml" xmlns:w15="http://schemas.microsoft.com/office/word/2012/wordml" xmlns:w16cex="http://schemas.microsoft.com/office/word/2018/wordml/cex" xmlns:w16cid="http://schemas.microsoft.com/office/word/2016/wordml/cid" xmlns:w16="http://schemas.microsoft.com/office/word/2018/wordml" xmlns:w16sdtdh="http://schemas.microsoft.com/office/word/2020/wordml/sdtdatahash" xmlns:w16se="http://schemas.microsoft.com/office/word/2015/wordml/symex" xmlns:wpg="http://schemas.microsoft.com/office/word/2010/wordprocessingGroup" xmlns:wpi="http://schemas.microsoft.com/office/word/2010/wordprocessingInk" xmlns:wne="http://schemas.microsoft.com/office/word/2006/wordml" xmlns:wps="http://schemas.microsoft.com/office/word/2010/wordprocessingShape" mc:Ignorable="w14 w15 w16se w16cid w16 w16cex w16sdtdh wp14">
+<w:footnotes xmlns:wpc="http://schemas.microsoft.com/office/word/2010/wordprocessingCanvas" xmlns:cx="http://schemas.microsoft.com/office/drawing/2014/chartex" xmlns:cx1="http://schemas.microsoft.com/office/drawing/2015/9/8/chartex" xmlns:cx2="http://schemas.microsoft.com/office/drawing/2015/10/21/chartex" xmlns:cx3="http://schemas.microsoft.com/office/drawing/2016/5/9/chartex" xmlns:cx4="http://schemas.microsoft.com/office/drawing/2016/5/10/chartex" xmlns:cx5="http://schemas.microsoft.com/office/drawing/2016/5/11/chartex" xmlns:cx6="http://schemas.microsoft.com/office/drawing/2016/5/12/chartex" xmlns:cx7="http://schemas.microsoft.com/office/drawing/2016/5/13/chartex" xmlns:cx8="http://schemas.microsoft.com/office/drawing/2016/5/14/chartex" xmlns:mc="http://schemas.openxmlformats.org/markup-compatibility/2006" xmlns:aink="http://schemas.microsoft.com/office/drawing/2016/ink" xmlns:am3d="http://schemas.microsoft.com/office/drawing/2017/model3d" xmlns:o="urn:schemas-microsoft-com:office:office" xmlns:oel="http://schemas.microsoft.com/office/2019/extlst" xmlns:r="http://schemas.openxmlformats.org/officeDocument/2006/relationships" xmlns:m="http://schemas.openxmlformats.org/officeDocument/2006/math" xmlns:v="urn:schemas-microsoft-com:vml" xmlns:wp14="http://schemas.microsoft.com/office/word/2010/wordprocessingDrawing" xmlns:wp="http://schemas.openxmlformats.org/drawingml/2006/wordprocessingDrawing" xmlns:w10="urn:schemas-microsoft-com:office:word" xmlns:w="http://schemas.openxmlformats.org/wordprocessingml/2006/main" xmlns:w14="http://schemas.microsoft.com/office/word/2010/wordml" xmlns:w15="http://schemas.microsoft.com/office/word/2012/wordml" xmlns:w16cex="http://schemas.microsoft.com/office/word/2018/wordml/cex" xmlns:w16cid="http://schemas.microsoft.com/office/word/2016/wordml/cid" xmlns:w16="http://schemas.microsoft.com/office/word/2018/wordml" xmlns:w16du="http://schemas.microsoft.com/office/word/2023/wordml/word16du" xmlns:w16sdtdh="http://schemas.microsoft.com/office/word/2020/wordml/sdtdatahash" xmlns:w16sdtfl="http://schemas.microsoft.com/office/word/2024/wordml/sdtformatlock" xmlns:w16se="http://schemas.microsoft.com/office/word/2015/wordml/symex" xmlns:wpg="http://schemas.microsoft.com/office/word/2010/wordprocessingGroup" xmlns:wpi="http://schemas.microsoft.com/office/word/2010/wordprocessingInk" xmlns:wne="http://schemas.microsoft.com/office/word/2006/wordml" xmlns:wps="http://schemas.microsoft.com/office/word/2010/wordprocessingShape" mc:Ignorable="w14 w15 w16se w16cid w16 w16cex w16sdtdh w16sdtfl w16du wp14">
   <w:footnote w:type="separator" w:id="-1">
     <w:p>
       <w:r>
@@ -5658,7 +5362,7 @@
 </file>
 
 <file path=word/header1.xml><?xml version="1.0" encoding="utf-8"?>
-<w:hdr xmlns:wpc="http://schemas.microsoft.com/office/word/2010/wordprocessingCanvas" xmlns:cx="http://schemas.microsoft.com/office/drawing/2014/chartex" xmlns:cx1="http://schemas.microsoft.com/office/drawing/2015/9/8/chartex" xmlns:cx2="http://schemas.microsoft.com/office/drawing/2015/10/21/chartex" xmlns:cx3="http://schemas.microsoft.com/office/drawing/2016/5/9/chartex" xmlns:cx4="http://schemas.microsoft.com/office/drawing/2016/5/10/chartex" xmlns:cx5="http://schemas.microsoft.com/office/drawing/2016/5/11/chartex" xmlns:cx6="http://schemas.microsoft.com/office/drawing/2016/5/12/chartex" xmlns:cx7="http://schemas.microsoft.com/office/drawing/2016/5/13/chartex" xmlns:cx8="http://schemas.microsoft.com/office/drawing/2016/5/14/chartex" xmlns:mc="http://schemas.openxmlformats.org/markup-compatibility/2006" xmlns:aink="http://schemas.microsoft.com/office/drawing/2016/ink" xmlns:am3d="http://schemas.microsoft.com/office/drawing/2017/model3d" xmlns:o="urn:schemas-microsoft-com:office:office" xmlns:r="http://schemas.openxmlformats.org/officeDocument/2006/relationships" xmlns:m="http://schemas.openxmlformats.org/officeDocument/2006/math" xmlns:v="urn:schemas-microsoft-com:vml" xmlns:wp14="http://schemas.microsoft.com/office/word/2010/wordprocessingDrawing" xmlns:wp="http://schemas.openxmlformats.org/drawingml/2006/wordprocessingDrawing" xmlns:w10="urn:schemas-microsoft-com:office:word" xmlns:w="http://schemas.openxmlformats.org/wordprocessingml/2006/main" xmlns:w14="http://schemas.microsoft.com/office/word/2010/wordml" xmlns:w15="http://schemas.microsoft.com/office/word/2012/wordml" xmlns:w16cex="http://schemas.microsoft.com/office/word/2018/wordml/cex" xmlns:w16cid="http://schemas.microsoft.com/office/word/2016/wordml/cid" xmlns:w16="http://schemas.microsoft.com/office/word/2018/wordml" xmlns:w16sdtdh="http://schemas.microsoft.com/office/word/2020/wordml/sdtdatahash" xmlns:w16se="http://schemas.microsoft.com/office/word/2015/wordml/symex" xmlns:wpg="http://schemas.microsoft.com/office/word/2010/wordprocessingGroup" xmlns:wpi="http://schemas.microsoft.com/office/word/2010/wordprocessingInk" xmlns:wne="http://schemas.microsoft.com/office/word/2006/wordml" xmlns:wps="http://schemas.microsoft.com/office/word/2010/wordprocessingShape" mc:Ignorable="w14 w15 w16se w16cid w16 w16cex w16sdtdh wp14">
+<w:hdr xmlns:wpc="http://schemas.microsoft.com/office/word/2010/wordprocessingCanvas" xmlns:cx="http://schemas.microsoft.com/office/drawing/2014/chartex" xmlns:cx1="http://schemas.microsoft.com/office/drawing/2015/9/8/chartex" xmlns:cx2="http://schemas.microsoft.com/office/drawing/2015/10/21/chartex" xmlns:cx3="http://schemas.microsoft.com/office/drawing/2016/5/9/chartex" xmlns:cx4="http://schemas.microsoft.com/office/drawing/2016/5/10/chartex" xmlns:cx5="http://schemas.microsoft.com/office/drawing/2016/5/11/chartex" xmlns:cx6="http://schemas.microsoft.com/office/drawing/2016/5/12/chartex" xmlns:cx7="http://schemas.microsoft.com/office/drawing/2016/5/13/chartex" xmlns:cx8="http://schemas.microsoft.com/office/drawing/2016/5/14/chartex" xmlns:mc="http://schemas.openxmlformats.org/markup-compatibility/2006" xmlns:aink="http://schemas.microsoft.com/office/drawing/2016/ink" xmlns:am3d="http://schemas.microsoft.com/office/drawing/2017/model3d" xmlns:o="urn:schemas-microsoft-com:office:office" xmlns:oel="http://schemas.microsoft.com/office/2019/extlst" xmlns:r="http://schemas.openxmlformats.org/officeDocument/2006/relationships" xmlns:m="http://schemas.openxmlformats.org/officeDocument/2006/math" xmlns:v="urn:schemas-microsoft-com:vml" xmlns:wp14="http://schemas.microsoft.com/office/word/2010/wordprocessingDrawing" xmlns:wp="http://schemas.openxmlformats.org/drawingml/2006/wordprocessingDrawing" xmlns:w10="urn:schemas-microsoft-com:office:word" xmlns:w="http://schemas.openxmlformats.org/wordprocessingml/2006/main" xmlns:w14="http://schemas.microsoft.com/office/word/2010/wordml" xmlns:w15="http://schemas.microsoft.com/office/word/2012/wordml" xmlns:w16cex="http://schemas.microsoft.com/office/word/2018/wordml/cex" xmlns:w16cid="http://schemas.microsoft.com/office/word/2016/wordml/cid" xmlns:w16="http://schemas.microsoft.com/office/word/2018/wordml" xmlns:w16du="http://schemas.microsoft.com/office/word/2023/wordml/word16du" xmlns:w16sdtdh="http://schemas.microsoft.com/office/word/2020/wordml/sdtdatahash" xmlns:w16sdtfl="http://schemas.microsoft.com/office/word/2024/wordml/sdtformatlock" xmlns:w16se="http://schemas.microsoft.com/office/word/2015/wordml/symex" xmlns:wpg="http://schemas.microsoft.com/office/word/2010/wordprocessingGroup" xmlns:wpi="http://schemas.microsoft.com/office/word/2010/wordprocessingInk" xmlns:wne="http://schemas.microsoft.com/office/word/2006/wordml" xmlns:wps="http://schemas.microsoft.com/office/word/2010/wordprocessingShape" mc:Ignorable="w14 w15 w16se w16cid w16 w16cex w16sdtdh w16sdtfl w16du wp14">
   <w:p>
     <w:pPr>
       <w:pStyle w:val="Header"/>
@@ -5869,7 +5573,7 @@
         </mc:Choice>
         <mc:Fallback>
           <w:pict>
-            <v:group w14:anchorId="5719E2F8" id="Group 47" o:spid="_x0000_s1026" style="position:absolute;margin-left:-5.65pt;margin-top:-11.55pt;width:481pt;height:31.15pt;z-index:251671552;mso-width-relative:margin" coordsize="61091,3957" o:gfxdata="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">
+            <v:group w14:anchorId="5719E2F8" id="Group 47" o:spid="_x0000_s1026" style="position:absolute;margin-left:-5.65pt;margin-top:-11.55pt;width:481pt;height:31.15pt;z-index:251671552;mso-width-relative:margin" coordsize="61091,3957" o:gfxdata="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">
               <v:rect id="Rectangle 48" o:spid="_x0000_s1027" style="position:absolute;left:1033;top:2623;width:59246;height:1334;visibility:visible;mso-wrap-style:square;v-text-anchor:middle" o:gfxdata="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" fillcolor="#0035ad" stroked="f" strokeweight="1pt"/>
               <v:shapetype id="_x0000_t202" coordsize="21600,21600" o:spt="202" path="m,l,21600r21600,l21600,xe">
                 <v:stroke joinstyle="miter"/>
@@ -5935,7 +5639,7 @@
 </file>
 
 <file path=word/header2.xml><?xml version="1.0" encoding="utf-8"?>
-<w:hdr xmlns:wpc="http://schemas.microsoft.com/office/word/2010/wordprocessingCanvas" xmlns:cx="http://schemas.microsoft.com/office/drawing/2014/chartex" xmlns:cx1="http://schemas.microsoft.com/office/drawing/2015/9/8/chartex" xmlns:cx2="http://schemas.microsoft.com/office/drawing/2015/10/21/chartex" xmlns:cx3="http://schemas.microsoft.com/office/drawing/2016/5/9/chartex" xmlns:cx4="http://schemas.microsoft.com/office/drawing/2016/5/10/chartex" xmlns:cx5="http://schemas.microsoft.com/office/drawing/2016/5/11/chartex" xmlns:cx6="http://schemas.microsoft.com/office/drawing/2016/5/12/chartex" xmlns:cx7="http://schemas.microsoft.com/office/drawing/2016/5/13/chartex" xmlns:cx8="http://schemas.microsoft.com/office/drawing/2016/5/14/chartex" xmlns:mc="http://schemas.openxmlformats.org/markup-compatibility/2006" xmlns:aink="http://schemas.microsoft.com/office/drawing/2016/ink" xmlns:am3d="http://schemas.microsoft.com/office/drawing/2017/model3d" xmlns:o="urn:schemas-microsoft-com:office:office" xmlns:r="http://schemas.openxmlformats.org/officeDocument/2006/relationships" xmlns:m="http://schemas.openxmlformats.org/officeDocument/2006/math" xmlns:v="urn:schemas-microsoft-com:vml" xmlns:wp14="http://schemas.microsoft.com/office/word/2010/wordprocessingDrawing" xmlns:wp="http://schemas.openxmlformats.org/drawingml/2006/wordprocessingDrawing" xmlns:w10="urn:schemas-microsoft-com:office:word" xmlns:w="http://schemas.openxmlformats.org/wordprocessingml/2006/main" xmlns:w14="http://schemas.microsoft.com/office/word/2010/wordml" xmlns:w15="http://schemas.microsoft.com/office/word/2012/wordml" xmlns:w16cex="http://schemas.microsoft.com/office/word/2018/wordml/cex" xmlns:w16cid="http://schemas.microsoft.com/office/word/2016/wordml/cid" xmlns:w16="http://schemas.microsoft.com/office/word/2018/wordml" xmlns:w16sdtdh="http://schemas.microsoft.com/office/word/2020/wordml/sdtdatahash" xmlns:w16se="http://schemas.microsoft.com/office/word/2015/wordml/symex" xmlns:wpg="http://schemas.microsoft.com/office/word/2010/wordprocessingGroup" xmlns:wpi="http://schemas.microsoft.com/office/word/2010/wordprocessingInk" xmlns:wne="http://schemas.microsoft.com/office/word/2006/wordml" xmlns:wps="http://schemas.microsoft.com/office/word/2010/wordprocessingShape" mc:Ignorable="w14 w15 w16se w16cid w16 w16cex w16sdtdh wp14">
+<w:hdr xmlns:wpc="http://schemas.microsoft.com/office/word/2010/wordprocessingCanvas" xmlns:cx="http://schemas.microsoft.com/office/drawing/2014/chartex" xmlns:cx1="http://schemas.microsoft.com/office/drawing/2015/9/8/chartex" xmlns:cx2="http://schemas.microsoft.com/office/drawing/2015/10/21/chartex" xmlns:cx3="http://schemas.microsoft.com/office/drawing/2016/5/9/chartex" xmlns:cx4="http://schemas.microsoft.com/office/drawing/2016/5/10/chartex" xmlns:cx5="http://schemas.microsoft.com/office/drawing/2016/5/11/chartex" xmlns:cx6="http://schemas.microsoft.com/office/drawing/2016/5/12/chartex" xmlns:cx7="http://schemas.microsoft.com/office/drawing/2016/5/13/chartex" xmlns:cx8="http://schemas.microsoft.com/office/drawing/2016/5/14/chartex" xmlns:mc="http://schemas.openxmlformats.org/markup-compatibility/2006" xmlns:aink="http://schemas.microsoft.com/office/drawing/2016/ink" xmlns:am3d="http://schemas.microsoft.com/office/drawing/2017/model3d" xmlns:o="urn:schemas-microsoft-com:office:office" xmlns:oel="http://schemas.microsoft.com/office/2019/extlst" xmlns:r="http://schemas.openxmlformats.org/officeDocument/2006/relationships" xmlns:m="http://schemas.openxmlformats.org/officeDocument/2006/math" xmlns:v="urn:schemas-microsoft-com:vml" xmlns:wp14="http://schemas.microsoft.com/office/word/2010/wordprocessingDrawing" xmlns:wp="http://schemas.openxmlformats.org/drawingml/2006/wordprocessingDrawing" xmlns:w10="urn:schemas-microsoft-com:office:word" xmlns:w="http://schemas.openxmlformats.org/wordprocessingml/2006/main" xmlns:w14="http://schemas.microsoft.com/office/word/2010/wordml" xmlns:w15="http://schemas.microsoft.com/office/word/2012/wordml" xmlns:w16cex="http://schemas.microsoft.com/office/word/2018/wordml/cex" xmlns:w16cid="http://schemas.microsoft.com/office/word/2016/wordml/cid" xmlns:w16="http://schemas.microsoft.com/office/word/2018/wordml" xmlns:w16du="http://schemas.microsoft.com/office/word/2023/wordml/word16du" xmlns:w16sdtdh="http://schemas.microsoft.com/office/word/2020/wordml/sdtdatahash" xmlns:w16sdtfl="http://schemas.microsoft.com/office/word/2024/wordml/sdtformatlock" xmlns:w16se="http://schemas.microsoft.com/office/word/2015/wordml/symex" xmlns:wpg="http://schemas.microsoft.com/office/word/2010/wordprocessingGroup" xmlns:wpi="http://schemas.microsoft.com/office/word/2010/wordprocessingInk" xmlns:wne="http://schemas.microsoft.com/office/word/2006/wordml" xmlns:wps="http://schemas.microsoft.com/office/word/2010/wordprocessingShape" mc:Ignorable="w14 w15 w16se w16cid w16 w16cex w16sdtdh w16sdtfl w16du wp14">
   <w:p>
     <w:pPr>
       <w:pStyle w:val="Header"/>
@@ -5964,7 +5668,7 @@
           <v:path o:extrusionok="f" gradientshapeok="t" o:connecttype="rect"/>
           <o:lock v:ext="edit" aspectratio="t"/>
         </v:shapetype>
-        <v:shape id="_x0000_s2049" type="#_x0000_t75" style="position:absolute;margin-left:411.9pt;margin-top:38.45pt;width:55.7pt;height:19.35pt;z-index:251675648;mso-position-horizontal-relative:text;mso-position-vertical-relative:text;mso-width-relative:page;mso-height-relative:page">
+        <v:shape id="_x0000_s1025" type="#_x0000_t75" style="position:absolute;margin-left:411.9pt;margin-top:38.45pt;width:55.7pt;height:19.35pt;z-index:251675648;mso-position-horizontal-relative:text;mso-position-vertical-relative:text;mso-width-relative:page;mso-height-relative:page">
           <v:imagedata r:id="rId1" o:title="by-nd"/>
         </v:shape>
       </w:pict>
@@ -6211,7 +5915,7 @@
         </mc:Choice>
         <mc:Fallback>
           <w:pict>
-            <v:group w14:anchorId="5D04AA74" id="Group 6" o:spid="_x0000_s1042" style="position:absolute;margin-left:-7pt;margin-top:-5.4pt;width:484pt;height:42pt;z-index:251658240" coordsize="61468,5334" o:gfxdata="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">
+            <v:group w14:anchorId="5D04AA74" id="Group 6" o:spid="_x0000_s1042" style="position:absolute;margin-left:-7pt;margin-top:-5.4pt;width:484pt;height:42pt;z-index:251658240" coordsize="61468,5334" o:gfxdata="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">
               <v:rect id="Rectangle 7" o:spid="_x0000_s1043" style="position:absolute;left:1016;top:4000;width:59245;height:1334;visibility:visible;mso-wrap-style:square;v-text-anchor:middle" o:gfxdata="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" fillcolor="#0035ad" stroked="f" strokeweight="1pt"/>
               <v:shape id="Picture 8" o:spid="_x0000_s1044" type="#_x0000_t75" style="position:absolute;left:47180;width:3366;height:3810;visibility:visible;mso-wrap-style:square" o:gfxdata="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">
                 <v:imagedata r:id="rId3" o:title="Logo" croptop="5869f" cropbottom="7336f" cropleft="20032f" cropright="19097f"/>
@@ -6282,7 +5986,7 @@
 </file>
 
 <file path=word/numbering.xml><?xml version="1.0" encoding="utf-8"?>
-<w:numbering xmlns:wpc="http://schemas.microsoft.com/office/word/2010/wordprocessingCanvas" xmlns:cx="http://schemas.microsoft.com/office/drawing/2014/chartex" xmlns:cx1="http://schemas.microsoft.com/office/drawing/2015/9/8/chartex" xmlns:cx2="http://schemas.microsoft.com/office/drawing/2015/10/21/chartex" xmlns:cx3="http://schemas.microsoft.com/office/drawing/2016/5/9/chartex" xmlns:cx4="http://schemas.microsoft.com/office/drawing/2016/5/10/chartex" xmlns:cx5="http://schemas.microsoft.com/office/drawing/2016/5/11/chartex" xmlns:cx6="http://schemas.microsoft.com/office/drawing/2016/5/12/chartex" xmlns:cx7="http://schemas.microsoft.com/office/drawing/2016/5/13/chartex" xmlns:cx8="http://schemas.microsoft.com/office/drawing/2016/5/14/chartex" xmlns:mc="http://schemas.openxmlformats.org/markup-compatibility/2006" xmlns:aink="http://schemas.microsoft.com/office/drawing/2016/ink" xmlns:am3d="http://schemas.microsoft.com/office/drawing/2017/model3d" xmlns:o="urn:schemas-microsoft-com:office:office" xmlns:r="http://schemas.openxmlformats.org/officeDocument/2006/relationships" xmlns:m="http://schemas.openxmlformats.org/officeDocument/2006/math" xmlns:v="urn:schemas-microsoft-com:vml" xmlns:wp14="http://schemas.microsoft.com/office/word/2010/wordprocessingDrawing" xmlns:wp="http://schemas.openxmlformats.org/drawingml/2006/wordprocessingDrawing" xmlns:w10="urn:schemas-microsoft-com:office:word" xmlns:w="http://schemas.openxmlformats.org/wordprocessingml/2006/main" xmlns:w14="http://schemas.microsoft.com/office/word/2010/wordml" xmlns:w15="http://schemas.microsoft.com/office/word/2012/wordml" xmlns:w16cex="http://schemas.microsoft.com/office/word/2018/wordml/cex" xmlns:w16cid="http://schemas.microsoft.com/office/word/2016/wordml/cid" xmlns:w16="http://schemas.microsoft.com/office/word/2018/wordml" xmlns:w16sdtdh="http://schemas.microsoft.com/office/word/2020/wordml/sdtdatahash" xmlns:w16se="http://schemas.microsoft.com/office/word/2015/wordml/symex" xmlns:wpg="http://schemas.microsoft.com/office/word/2010/wordprocessingGroup" xmlns:wpi="http://schemas.microsoft.com/office/word/2010/wordprocessingInk" xmlns:wne="http://schemas.microsoft.com/office/word/2006/wordml" xmlns:wps="http://schemas.microsoft.com/office/word/2010/wordprocessingShape" mc:Ignorable="w14 w15 w16se w16cid w16 w16cex w16sdtdh wp14">
+<w:numbering xmlns:wpc="http://schemas.microsoft.com/office/word/2010/wordprocessingCanvas" xmlns:cx="http://schemas.microsoft.com/office/drawing/2014/chartex" xmlns:cx1="http://schemas.microsoft.com/office/drawing/2015/9/8/chartex" xmlns:cx2="http://schemas.microsoft.com/office/drawing/2015/10/21/chartex" xmlns:cx3="http://schemas.microsoft.com/office/drawing/2016/5/9/chartex" xmlns:cx4="http://schemas.microsoft.com/office/drawing/2016/5/10/chartex" xmlns:cx5="http://schemas.microsoft.com/office/drawing/2016/5/11/chartex" xmlns:cx6="http://schemas.microsoft.com/office/drawing/2016/5/12/chartex" xmlns:cx7="http://schemas.microsoft.com/office/drawing/2016/5/13/chartex" xmlns:cx8="http://schemas.microsoft.com/office/drawing/2016/5/14/chartex" xmlns:mc="http://schemas.openxmlformats.org/markup-compatibility/2006" xmlns:aink="http://schemas.microsoft.com/office/drawing/2016/ink" xmlns:am3d="http://schemas.microsoft.com/office/drawing/2017/model3d" xmlns:o="urn:schemas-microsoft-com:office:office" xmlns:oel="http://schemas.microsoft.com/office/2019/extlst" xmlns:r="http://schemas.openxmlformats.org/officeDocument/2006/relationships" xmlns:m="http://schemas.openxmlformats.org/officeDocument/2006/math" xmlns:v="urn:schemas-microsoft-com:vml" xmlns:wp14="http://schemas.microsoft.com/office/word/2010/wordprocessingDrawing" xmlns:wp="http://schemas.openxmlformats.org/drawingml/2006/wordprocessingDrawing" xmlns:w10="urn:schemas-microsoft-com:office:word" xmlns:w="http://schemas.openxmlformats.org/wordprocessingml/2006/main" xmlns:w14="http://schemas.microsoft.com/office/word/2010/wordml" xmlns:w15="http://schemas.microsoft.com/office/word/2012/wordml" xmlns:w16cex="http://schemas.microsoft.com/office/word/2018/wordml/cex" xmlns:w16cid="http://schemas.microsoft.com/office/word/2016/wordml/cid" xmlns:w16="http://schemas.microsoft.com/office/word/2018/wordml" xmlns:w16du="http://schemas.microsoft.com/office/word/2023/wordml/word16du" xmlns:w16sdtdh="http://schemas.microsoft.com/office/word/2020/wordml/sdtdatahash" xmlns:w16sdtfl="http://schemas.microsoft.com/office/word/2024/wordml/sdtformatlock" xmlns:w16se="http://schemas.microsoft.com/office/word/2015/wordml/symex" xmlns:wpg="http://schemas.microsoft.com/office/word/2010/wordprocessingGroup" xmlns:wpi="http://schemas.microsoft.com/office/word/2010/wordprocessingInk" xmlns:wne="http://schemas.microsoft.com/office/word/2006/wordml" xmlns:wps="http://schemas.microsoft.com/office/word/2010/wordprocessingShape" mc:Ignorable="w14 w15 w16se w16cid w16 w16cex w16sdtdh w16sdtfl w16du wp14">
   <w:abstractNum w:abstractNumId="0" w15:restartNumberingAfterBreak="0">
     <w:nsid w:val="05F659E8"/>
     <w:multiLevelType w:val="hybridMultilevel"/>
@@ -6975,32 +6679,32 @@
       </w:rPr>
     </w:lvl>
   </w:abstractNum>
-  <w:num w:numId="1">
+  <w:num w:numId="1" w16cid:durableId="730495574">
     <w:abstractNumId w:val="0"/>
   </w:num>
-  <w:num w:numId="2">
+  <w:num w:numId="2" w16cid:durableId="1610432710">
     <w:abstractNumId w:val="1"/>
   </w:num>
-  <w:num w:numId="3">
+  <w:num w:numId="3" w16cid:durableId="1495679079">
     <w:abstractNumId w:val="6"/>
   </w:num>
-  <w:num w:numId="4">
+  <w:num w:numId="4" w16cid:durableId="1937472079">
     <w:abstractNumId w:val="5"/>
   </w:num>
-  <w:num w:numId="5">
+  <w:num w:numId="5" w16cid:durableId="1350065860">
     <w:abstractNumId w:val="2"/>
   </w:num>
-  <w:num w:numId="6">
+  <w:num w:numId="6" w16cid:durableId="1189104684">
     <w:abstractNumId w:val="4"/>
   </w:num>
-  <w:num w:numId="7">
+  <w:num w:numId="7" w16cid:durableId="2104565508">
     <w:abstractNumId w:val="3"/>
   </w:num>
 </w:numbering>
 </file>
 
 <file path=word/styles.xml><?xml version="1.0" encoding="utf-8"?>
-<w:styles xmlns:mc="http://schemas.openxmlformats.org/markup-compatibility/2006" xmlns:r="http://schemas.openxmlformats.org/officeDocument/2006/relationships" xmlns:w="http://schemas.openxmlformats.org/wordprocessingml/2006/main" xmlns:w14="http://schemas.microsoft.com/office/word/2010/wordml" xmlns:w15="http://schemas.microsoft.com/office/word/2012/wordml" xmlns:w16cex="http://schemas.microsoft.com/office/word/2018/wordml/cex" xmlns:w16cid="http://schemas.microsoft.com/office/word/2016/wordml/cid" xmlns:w16="http://schemas.microsoft.com/office/word/2018/wordml" xmlns:w16sdtdh="http://schemas.microsoft.com/office/word/2020/wordml/sdtdatahash" xmlns:w16se="http://schemas.microsoft.com/office/word/2015/wordml/symex" mc:Ignorable="w14 w15 w16se w16cid w16 w16cex w16sdtdh">
+<w:styles xmlns:mc="http://schemas.openxmlformats.org/markup-compatibility/2006" xmlns:r="http://schemas.openxmlformats.org/officeDocument/2006/relationships" xmlns:w="http://schemas.openxmlformats.org/wordprocessingml/2006/main" xmlns:w14="http://schemas.microsoft.com/office/word/2010/wordml" xmlns:w15="http://schemas.microsoft.com/office/word/2012/wordml" xmlns:w16cex="http://schemas.microsoft.com/office/word/2018/wordml/cex" xmlns:w16cid="http://schemas.microsoft.com/office/word/2016/wordml/cid" xmlns:w16="http://schemas.microsoft.com/office/word/2018/wordml" xmlns:w16du="http://schemas.microsoft.com/office/word/2023/wordml/word16du" xmlns:w16sdtdh="http://schemas.microsoft.com/office/word/2020/wordml/sdtdatahash" xmlns:w16sdtfl="http://schemas.microsoft.com/office/word/2024/wordml/sdtformatlock" xmlns:w16se="http://schemas.microsoft.com/office/word/2015/wordml/symex" mc:Ignorable="w14 w15 w16se w16cid w16 w16cex w16sdtdh w16sdtfl w16du">
   <w:docDefaults>
     <w:rPrDefault>
       <w:rPr>

</xml_diff>